<commit_message>
Merge compendium into one volume: 10_The_Compendium.pdf (41pp)
Part I Bestiary, Part II Treasures & Relics, Part III Custom Content
in a single document; publish.py and README updated; three separate
compendium PDFs removed from the root list.

Co-Authored-By: Claude Opus 4.8 <noreply@anthropic.com>
</commit_message>
<xml_diff>
--- a/sessions/session_04_shadows_and_songs.docx
+++ b/sessions/session_04_shadows_and_songs.docx
@@ -1897,22 +1897,7 @@
           <w:color w:val="B8860B"/>
           <w:sz w:val="32"/>
         </w:rPr>
-        <w:t>Part Three: The Lorekeeper's Tale</w:t>
-      </w:r>
-    </w:p>
-    <w:p>
-      <w:pPr>
-        <w:spacing w:before="120" w:after="200"/>
-      </w:pPr>
-      <w:r>
-        <w:rPr>
-          <w:rFonts w:ascii="Georgia" w:hAnsi="Georgia" w:cs="Georgia"/>
-          <w:b w:val="0"/>
-          <w:i/>
-          <w:color w:val="222222"/>
-          <w:sz w:val="21"/>
-        </w:rPr>
-        <w:t>With eight bells wrapped warm in their packs, the heroes crossed town as the light failed, to a small cottage swallowed in ivy at the edge of Havenmoor.</w:t>
+        <w:t>The Frozen Roads: A Winter Bestiary of Chances</w:t>
       </w:r>
     </w:p>
     <w:p>
@@ -1932,27 +1917,7 @@
           <w:color w:val="222222"/>
           <w:sz w:val="21"/>
         </w:rPr>
-        <w:t xml:space="preserve">The door creaks open before anyone can knock. </w:t>
-      </w:r>
-      <w:r>
-        <w:rPr>
-          <w:rFonts w:ascii="Georgia" w:hAnsi="Georgia" w:cs="Georgia"/>
-          <w:b/>
-          <w:i w:val="0"/>
-          <w:color w:val="222222"/>
-          <w:sz w:val="21"/>
-        </w:rPr>
-        <w:t>Faelan</w:t>
-      </w:r>
-      <w:r>
-        <w:rPr>
-          <w:rFonts w:ascii="Georgia" w:hAnsi="Georgia" w:cs="Georgia"/>
-          <w:b w:val="0"/>
-          <w:i w:val="0"/>
-          <w:color w:val="222222"/>
-          <w:sz w:val="21"/>
-        </w:rPr>
-        <w:t>, the village lorekeeper, is an elderly half-elf with long silver hair and piercing violet eyes, wrapped in a deep green cloak stitched with symbols of winter and renewal. “Welcome, brave ones. You have done well to gather the bells: relics of light and hope. Please, come in. We have much to discuss.”</w:t>
+        <w:t>The roads around Havenmoor that week were thick with wonders and dangers. Not all of them crossed the heroes' path, but every one of them was out there, waiting in the white silence between the pines. What follows is the DM's deck of chances, exactly as it hung over every journey out of town that winter.</w:t>
       </w:r>
     </w:p>
     <w:p>
@@ -1964,7 +1929,7 @@
       <w:r>
         <w:drawing>
           <wp:inline xmlns:a="http://schemas.openxmlformats.org/drawingml/2006/main" xmlns:pic="http://schemas.openxmlformats.org/drawingml/2006/picture">
-            <wp:extent cx="3566160" cy="3566160"/>
+            <wp:extent cx="3291840" cy="3291840"/>
             <wp:docPr id="5" name="Picture 5"/>
             <wp:cNvGraphicFramePr>
               <a:graphicFrameLocks noChangeAspect="1"/>
@@ -1985,7 +1950,7 @@
                   <pic:spPr>
                     <a:xfrm>
                       <a:off x="0" y="0"/>
-                      <a:ext cx="3566160" cy="3566160"/>
+                      <a:ext cx="3291840" cy="3291840"/>
                     </a:xfrm>
                     <a:prstGeom prst="rect"/>
                   </pic:spPr>
@@ -2008,7 +1973,2187 @@
           <w:color w:val="888888"/>
           <w:sz w:val="18"/>
         </w:rPr>
-        <w:t>Faelan the lorekeeper, among his tomes and glowing crystals in the ivy cottage.</w:t>
+        <w:t>The frozen wilds around Havenmoor, where every step off the road was a roll of the dice.</w:t>
+      </w:r>
+    </w:p>
+    <w:p>
+      <w:pPr>
+        <w:pBdr>
+          <w:left w:val="single" w:sz="18" w:space="12" w:color="5B2A86"/>
+        </w:pBdr>
+        <w:shd w:val="clear" w:color="auto" w:fill="F4F0FA"/>
+        <w:spacing w:before="30" w:after="70"/>
+        <w:ind w:left="340" w:right="340"/>
+      </w:pPr>
+      <w:r>
+        <w:rPr>
+          <w:rFonts w:ascii="Georgia" w:hAnsi="Georgia" w:cs="Georgia"/>
+          <w:b w:val="0"/>
+          <w:i w:val="0"/>
+          <w:color w:val="222222"/>
+          <w:sz w:val="19"/>
+        </w:rPr>
+        <w:t xml:space="preserve">▶ </w:t>
+      </w:r>
+      <w:r>
+        <w:rPr>
+          <w:rFonts w:ascii="Georgia" w:hAnsi="Georgia" w:cs="Georgia"/>
+          <w:b/>
+          <w:i w:val="0"/>
+          <w:color w:val="222222"/>
+          <w:sz w:val="19"/>
+        </w:rPr>
+        <w:t>Travel Encounters.</w:t>
+      </w:r>
+      <w:r>
+        <w:rPr>
+          <w:rFonts w:ascii="Georgia" w:hAnsi="Georgia" w:cs="Georgia"/>
+          <w:b w:val="0"/>
+          <w:i w:val="0"/>
+          <w:color w:val="222222"/>
+          <w:sz w:val="19"/>
+        </w:rPr>
+        <w:t xml:space="preserve"> Whenever the party sets out through the frozen wilds around Havenmoor, roll a d20 on the table below. Notes on the most colorful entries follow; full statistics for every creature live in the bestiary compendium.</w:t>
+      </w:r>
+    </w:p>
+    <w:p>
+      <w:pPr>
+        <w:keepNext/>
+        <w:spacing w:before="220" w:after="60"/>
+      </w:pPr>
+      <w:r>
+        <w:rPr>
+          <w:rFonts w:ascii="Georgia" w:hAnsi="Georgia" w:cs="Georgia"/>
+          <w:b/>
+          <w:color w:val="A0522D"/>
+          <w:sz w:val="26"/>
+        </w:rPr>
+        <w:t>Travel Encounter Table (d20)</w:t>
+      </w:r>
+    </w:p>
+    <w:p>
+      <w:pPr>
+        <w:spacing w:after="80"/>
+      </w:pPr>
+      <w:r>
+        <w:rPr>
+          <w:rFonts w:ascii="Georgia" w:hAnsi="Georgia" w:cs="Georgia"/>
+          <w:b/>
+          <w:i w:val="0"/>
+          <w:color w:val="222222"/>
+          <w:sz w:val="21"/>
+        </w:rPr>
+        <w:t>1.</w:t>
+      </w:r>
+      <w:r>
+        <w:rPr>
+          <w:rFonts w:ascii="Georgia" w:hAnsi="Georgia" w:cs="Georgia"/>
+          <w:b w:val="0"/>
+          <w:i w:val="0"/>
+          <w:color w:val="222222"/>
+          <w:sz w:val="21"/>
+        </w:rPr>
+        <w:t xml:space="preserve"> Krampusshade's Minion: a shadowy imp attacks, attempting to steal something from the party.</w:t>
+      </w:r>
+    </w:p>
+    <w:p>
+      <w:pPr>
+        <w:spacing w:after="80"/>
+      </w:pPr>
+      <w:r>
+        <w:rPr>
+          <w:rFonts w:ascii="Georgia" w:hAnsi="Georgia" w:cs="Georgia"/>
+          <w:b/>
+          <w:i w:val="0"/>
+          <w:color w:val="222222"/>
+          <w:sz w:val="21"/>
+        </w:rPr>
+        <w:t>2.</w:t>
+      </w:r>
+      <w:r>
+        <w:rPr>
+          <w:rFonts w:ascii="Georgia" w:hAnsi="Georgia" w:cs="Georgia"/>
+          <w:b w:val="0"/>
+          <w:i w:val="0"/>
+          <w:color w:val="222222"/>
+          <w:sz w:val="21"/>
+        </w:rPr>
+        <w:t xml:space="preserve"> Frozen Wolves: 2d4 frost-covered wolves stalk the party, their eyes glowing with cold malice.</w:t>
+      </w:r>
+    </w:p>
+    <w:p>
+      <w:pPr>
+        <w:spacing w:after="80"/>
+      </w:pPr>
+      <w:r>
+        <w:rPr>
+          <w:rFonts w:ascii="Georgia" w:hAnsi="Georgia" w:cs="Georgia"/>
+          <w:b/>
+          <w:i w:val="0"/>
+          <w:color w:val="222222"/>
+          <w:sz w:val="21"/>
+        </w:rPr>
+        <w:t>3.</w:t>
+      </w:r>
+      <w:r>
+        <w:rPr>
+          <w:rFonts w:ascii="Georgia" w:hAnsi="Georgia" w:cs="Georgia"/>
+          <w:b w:val="0"/>
+          <w:i w:val="0"/>
+          <w:color w:val="222222"/>
+          <w:sz w:val="21"/>
+        </w:rPr>
+        <w:t xml:space="preserve"> Frostbite Pixies: mischievous pixies cast Ray of Frost and try to confuse the party.</w:t>
+      </w:r>
+    </w:p>
+    <w:p>
+      <w:pPr>
+        <w:spacing w:after="80"/>
+      </w:pPr>
+      <w:r>
+        <w:rPr>
+          <w:rFonts w:ascii="Georgia" w:hAnsi="Georgia" w:cs="Georgia"/>
+          <w:b/>
+          <w:i w:val="0"/>
+          <w:color w:val="222222"/>
+          <w:sz w:val="21"/>
+        </w:rPr>
+        <w:t>4.</w:t>
+      </w:r>
+      <w:r>
+        <w:rPr>
+          <w:rFonts w:ascii="Georgia" w:hAnsi="Georgia" w:cs="Georgia"/>
+          <w:b w:val="0"/>
+          <w:i w:val="0"/>
+          <w:color w:val="222222"/>
+          <w:sz w:val="21"/>
+        </w:rPr>
+        <w:t xml:space="preserve"> Icy Specter: a ghostly figure whispers a chilling warning before attacking.</w:t>
+      </w:r>
+    </w:p>
+    <w:p>
+      <w:pPr>
+        <w:spacing w:after="80"/>
+      </w:pPr>
+      <w:r>
+        <w:rPr>
+          <w:rFonts w:ascii="Georgia" w:hAnsi="Georgia" w:cs="Georgia"/>
+          <w:b/>
+          <w:i w:val="0"/>
+          <w:color w:val="222222"/>
+          <w:sz w:val="21"/>
+        </w:rPr>
+        <w:t>5.</w:t>
+      </w:r>
+      <w:r>
+        <w:rPr>
+          <w:rFonts w:ascii="Georgia" w:hAnsi="Georgia" w:cs="Georgia"/>
+          <w:b w:val="0"/>
+          <w:i w:val="0"/>
+          <w:color w:val="222222"/>
+          <w:sz w:val="21"/>
+        </w:rPr>
+        <w:t xml:space="preserve"> Snowbound Bandits: desperate bandits, half-mad with cold, ambush the party.</w:t>
+      </w:r>
+    </w:p>
+    <w:p>
+      <w:pPr>
+        <w:spacing w:after="80"/>
+      </w:pPr>
+      <w:r>
+        <w:rPr>
+          <w:rFonts w:ascii="Georgia" w:hAnsi="Georgia" w:cs="Georgia"/>
+          <w:b/>
+          <w:i w:val="0"/>
+          <w:color w:val="222222"/>
+          <w:sz w:val="21"/>
+        </w:rPr>
+        <w:t>6.</w:t>
+      </w:r>
+      <w:r>
+        <w:rPr>
+          <w:rFonts w:ascii="Georgia" w:hAnsi="Georgia" w:cs="Georgia"/>
+          <w:b w:val="0"/>
+          <w:i w:val="0"/>
+          <w:color w:val="222222"/>
+          <w:sz w:val="21"/>
+        </w:rPr>
+        <w:t xml:space="preserve"> Frost Golems: two small frost golems rise from the snow and attack.</w:t>
+      </w:r>
+    </w:p>
+    <w:p>
+      <w:pPr>
+        <w:spacing w:after="80"/>
+      </w:pPr>
+      <w:r>
+        <w:rPr>
+          <w:rFonts w:ascii="Georgia" w:hAnsi="Georgia" w:cs="Georgia"/>
+          <w:b/>
+          <w:i w:val="0"/>
+          <w:color w:val="222222"/>
+          <w:sz w:val="21"/>
+        </w:rPr>
+        <w:t>7.</w:t>
+      </w:r>
+      <w:r>
+        <w:rPr>
+          <w:rFonts w:ascii="Georgia" w:hAnsi="Georgia" w:cs="Georgia"/>
+          <w:b w:val="0"/>
+          <w:i w:val="0"/>
+          <w:color w:val="222222"/>
+          <w:sz w:val="21"/>
+        </w:rPr>
+        <w:t xml:space="preserve"> Blizzard Trap: a sudden blizzard cuts visibility to a few feet; Wisdom (Survival) DC 14 to avoid becoming lost.</w:t>
+      </w:r>
+    </w:p>
+    <w:p>
+      <w:pPr>
+        <w:spacing w:after="80"/>
+      </w:pPr>
+      <w:r>
+        <w:rPr>
+          <w:rFonts w:ascii="Georgia" w:hAnsi="Georgia" w:cs="Georgia"/>
+          <w:b/>
+          <w:i w:val="0"/>
+          <w:color w:val="222222"/>
+          <w:sz w:val="21"/>
+        </w:rPr>
+        <w:t>8.</w:t>
+      </w:r>
+      <w:r>
+        <w:rPr>
+          <w:rFonts w:ascii="Georgia" w:hAnsi="Georgia" w:cs="Georgia"/>
+          <w:b w:val="0"/>
+          <w:i w:val="0"/>
+          <w:color w:val="222222"/>
+          <w:sz w:val="21"/>
+        </w:rPr>
+        <w:t xml:space="preserve"> Enchanted Snowmen: three animated snowmen with coal-black eyes hurl snowballs laced with Ray of Frost.</w:t>
+      </w:r>
+    </w:p>
+    <w:p>
+      <w:pPr>
+        <w:spacing w:after="80"/>
+      </w:pPr>
+      <w:r>
+        <w:rPr>
+          <w:rFonts w:ascii="Georgia" w:hAnsi="Georgia" w:cs="Georgia"/>
+          <w:b/>
+          <w:i w:val="0"/>
+          <w:color w:val="222222"/>
+          <w:sz w:val="21"/>
+        </w:rPr>
+        <w:t>9.</w:t>
+      </w:r>
+      <w:r>
+        <w:rPr>
+          <w:rFonts w:ascii="Georgia" w:hAnsi="Georgia" w:cs="Georgia"/>
+          <w:b w:val="0"/>
+          <w:i w:val="0"/>
+          <w:color w:val="222222"/>
+          <w:sz w:val="21"/>
+        </w:rPr>
+        <w:t xml:space="preserve"> Yule Cat: a huge predatory feline prowls near the party, looking for those who have not been good.</w:t>
+      </w:r>
+    </w:p>
+    <w:p>
+      <w:pPr>
+        <w:spacing w:after="80"/>
+      </w:pPr>
+      <w:r>
+        <w:rPr>
+          <w:rFonts w:ascii="Georgia" w:hAnsi="Georgia" w:cs="Georgia"/>
+          <w:b/>
+          <w:i w:val="0"/>
+          <w:color w:val="222222"/>
+          <w:sz w:val="21"/>
+        </w:rPr>
+        <w:t>10.</w:t>
+      </w:r>
+      <w:r>
+        <w:rPr>
+          <w:rFonts w:ascii="Georgia" w:hAnsi="Georgia" w:cs="Georgia"/>
+          <w:b w:val="0"/>
+          <w:i w:val="0"/>
+          <w:color w:val="222222"/>
+          <w:sz w:val="21"/>
+        </w:rPr>
+        <w:t xml:space="preserve"> Friendly Caribou: a lost, enchanted caribou offers the party a brief rest and warmth.</w:t>
+      </w:r>
+    </w:p>
+    <w:p>
+      <w:pPr>
+        <w:spacing w:after="80"/>
+      </w:pPr>
+      <w:r>
+        <w:rPr>
+          <w:rFonts w:ascii="Georgia" w:hAnsi="Georgia" w:cs="Georgia"/>
+          <w:b/>
+          <w:i w:val="0"/>
+          <w:color w:val="222222"/>
+          <w:sz w:val="21"/>
+        </w:rPr>
+        <w:t>11.</w:t>
+      </w:r>
+      <w:r>
+        <w:rPr>
+          <w:rFonts w:ascii="Georgia" w:hAnsi="Georgia" w:cs="Georgia"/>
+          <w:b w:val="0"/>
+          <w:i w:val="0"/>
+          <w:color w:val="222222"/>
+          <w:sz w:val="21"/>
+        </w:rPr>
+        <w:t xml:space="preserve"> The Sleeping Traveler: a traveler frozen beneath the snow, one hand still holding a cryptic note or map.</w:t>
+      </w:r>
+    </w:p>
+    <w:p>
+      <w:pPr>
+        <w:spacing w:after="80"/>
+      </w:pPr>
+      <w:r>
+        <w:rPr>
+          <w:rFonts w:ascii="Georgia" w:hAnsi="Georgia" w:cs="Georgia"/>
+          <w:b/>
+          <w:i w:val="0"/>
+          <w:color w:val="222222"/>
+          <w:sz w:val="21"/>
+        </w:rPr>
+        <w:t>12.</w:t>
+      </w:r>
+      <w:r>
+        <w:rPr>
+          <w:rFonts w:ascii="Georgia" w:hAnsi="Georgia" w:cs="Georgia"/>
+          <w:b w:val="0"/>
+          <w:i w:val="0"/>
+          <w:color w:val="222222"/>
+          <w:sz w:val="21"/>
+        </w:rPr>
+        <w:t xml:space="preserve"> Holiday Illusions: visions of a warm celebration that hide a dangerous snow drift.</w:t>
+      </w:r>
+    </w:p>
+    <w:p>
+      <w:pPr>
+        <w:spacing w:after="80"/>
+      </w:pPr>
+      <w:r>
+        <w:rPr>
+          <w:rFonts w:ascii="Georgia" w:hAnsi="Georgia" w:cs="Georgia"/>
+          <w:b/>
+          <w:i w:val="0"/>
+          <w:color w:val="222222"/>
+          <w:sz w:val="21"/>
+        </w:rPr>
+        <w:t>13.</w:t>
+      </w:r>
+      <w:r>
+        <w:rPr>
+          <w:rFonts w:ascii="Georgia" w:hAnsi="Georgia" w:cs="Georgia"/>
+          <w:b w:val="0"/>
+          <w:i w:val="0"/>
+          <w:color w:val="222222"/>
+          <w:sz w:val="21"/>
+        </w:rPr>
+        <w:t xml:space="preserve"> Frozen Will-o'-Wisps: malevolent lights lure the party toward a frozen pond.</w:t>
+      </w:r>
+    </w:p>
+    <w:p>
+      <w:pPr>
+        <w:spacing w:after="80"/>
+      </w:pPr>
+      <w:r>
+        <w:rPr>
+          <w:rFonts w:ascii="Georgia" w:hAnsi="Georgia" w:cs="Georgia"/>
+          <w:b/>
+          <w:i w:val="0"/>
+          <w:color w:val="222222"/>
+          <w:sz w:val="21"/>
+        </w:rPr>
+        <w:t>14.</w:t>
+      </w:r>
+      <w:r>
+        <w:rPr>
+          <w:rFonts w:ascii="Georgia" w:hAnsi="Georgia" w:cs="Georgia"/>
+          <w:b w:val="0"/>
+          <w:i w:val="0"/>
+          <w:color w:val="222222"/>
+          <w:sz w:val="21"/>
+        </w:rPr>
+        <w:t xml:space="preserve"> Frost Hag Ambush: a frost hag disguised as a kind old woman offers poisoned treats.</w:t>
+      </w:r>
+    </w:p>
+    <w:p>
+      <w:pPr>
+        <w:spacing w:after="80"/>
+      </w:pPr>
+      <w:r>
+        <w:rPr>
+          <w:rFonts w:ascii="Georgia" w:hAnsi="Georgia" w:cs="Georgia"/>
+          <w:b/>
+          <w:i w:val="0"/>
+          <w:color w:val="222222"/>
+          <w:sz w:val="21"/>
+        </w:rPr>
+        <w:t>15.</w:t>
+      </w:r>
+      <w:r>
+        <w:rPr>
+          <w:rFonts w:ascii="Georgia" w:hAnsi="Georgia" w:cs="Georgia"/>
+          <w:b w:val="0"/>
+          <w:i w:val="0"/>
+          <w:color w:val="222222"/>
+          <w:sz w:val="21"/>
+        </w:rPr>
+        <w:t xml:space="preserve"> Ice Spiders: 2d6 ice spiders drop from the trees and attack.</w:t>
+      </w:r>
+    </w:p>
+    <w:p>
+      <w:pPr>
+        <w:spacing w:after="80"/>
+      </w:pPr>
+      <w:r>
+        <w:rPr>
+          <w:rFonts w:ascii="Georgia" w:hAnsi="Georgia" w:cs="Georgia"/>
+          <w:b/>
+          <w:i w:val="0"/>
+          <w:color w:val="222222"/>
+          <w:sz w:val="21"/>
+        </w:rPr>
+        <w:t>16.</w:t>
+      </w:r>
+      <w:r>
+        <w:rPr>
+          <w:rFonts w:ascii="Georgia" w:hAnsi="Georgia" w:cs="Georgia"/>
+          <w:b w:val="0"/>
+          <w:i w:val="0"/>
+          <w:color w:val="222222"/>
+          <w:sz w:val="21"/>
+        </w:rPr>
+        <w:t xml:space="preserve"> Resting Reindeer: a magical reindeer grants the party inspiration if treated kindly.</w:t>
+      </w:r>
+    </w:p>
+    <w:p>
+      <w:pPr>
+        <w:spacing w:after="80"/>
+      </w:pPr>
+      <w:r>
+        <w:rPr>
+          <w:rFonts w:ascii="Georgia" w:hAnsi="Georgia" w:cs="Georgia"/>
+          <w:b/>
+          <w:i w:val="0"/>
+          <w:color w:val="222222"/>
+          <w:sz w:val="21"/>
+        </w:rPr>
+        <w:t>17.</w:t>
+      </w:r>
+      <w:r>
+        <w:rPr>
+          <w:rFonts w:ascii="Georgia" w:hAnsi="Georgia" w:cs="Georgia"/>
+          <w:b w:val="0"/>
+          <w:i w:val="0"/>
+          <w:color w:val="222222"/>
+          <w:sz w:val="21"/>
+        </w:rPr>
+        <w:t xml:space="preserve"> Frozen Treasure: a chest sealed in a block of ice; Strength DC 15 or fire magic to open.</w:t>
+      </w:r>
+    </w:p>
+    <w:p>
+      <w:pPr>
+        <w:spacing w:after="80"/>
+      </w:pPr>
+      <w:r>
+        <w:rPr>
+          <w:rFonts w:ascii="Georgia" w:hAnsi="Georgia" w:cs="Georgia"/>
+          <w:b/>
+          <w:i w:val="0"/>
+          <w:color w:val="222222"/>
+          <w:sz w:val="21"/>
+        </w:rPr>
+        <w:t>18.</w:t>
+      </w:r>
+      <w:r>
+        <w:rPr>
+          <w:rFonts w:ascii="Georgia" w:hAnsi="Georgia" w:cs="Georgia"/>
+          <w:b w:val="0"/>
+          <w:i w:val="0"/>
+          <w:color w:val="222222"/>
+          <w:sz w:val="21"/>
+        </w:rPr>
+        <w:t xml:space="preserve"> Aurora Spirits: peaceful, glowing spirits offer a cryptic hint or prophecy.</w:t>
+      </w:r>
+    </w:p>
+    <w:p>
+      <w:pPr>
+        <w:spacing w:after="80"/>
+      </w:pPr>
+      <w:r>
+        <w:rPr>
+          <w:rFonts w:ascii="Georgia" w:hAnsi="Georgia" w:cs="Georgia"/>
+          <w:b/>
+          <w:i w:val="0"/>
+          <w:color w:val="222222"/>
+          <w:sz w:val="21"/>
+        </w:rPr>
+        <w:t>19.</w:t>
+      </w:r>
+      <w:r>
+        <w:rPr>
+          <w:rFonts w:ascii="Georgia" w:hAnsi="Georgia" w:cs="Georgia"/>
+          <w:b w:val="0"/>
+          <w:i w:val="0"/>
+          <w:color w:val="222222"/>
+          <w:sz w:val="21"/>
+        </w:rPr>
+        <w:t xml:space="preserve"> Fey Tricksters: playful fey challenge the party to a riddle contest or a harmless prank.</w:t>
+      </w:r>
+    </w:p>
+    <w:p>
+      <w:pPr>
+        <w:spacing w:after="80"/>
+      </w:pPr>
+      <w:r>
+        <w:rPr>
+          <w:rFonts w:ascii="Georgia" w:hAnsi="Georgia" w:cs="Georgia"/>
+          <w:b/>
+          <w:i w:val="0"/>
+          <w:color w:val="222222"/>
+          <w:sz w:val="21"/>
+        </w:rPr>
+        <w:t>20.</w:t>
+      </w:r>
+      <w:r>
+        <w:rPr>
+          <w:rFonts w:ascii="Georgia" w:hAnsi="Georgia" w:cs="Georgia"/>
+          <w:b w:val="0"/>
+          <w:i w:val="0"/>
+          <w:color w:val="222222"/>
+          <w:sz w:val="21"/>
+        </w:rPr>
+        <w:t xml:space="preserve"> Holiday Miracle: a warm breeze restores 1d4 hit points to each party member.</w:t>
+      </w:r>
+    </w:p>
+    <w:p>
+      <w:pPr>
+        <w:keepNext/>
+        <w:spacing w:before="220" w:after="60"/>
+      </w:pPr>
+      <w:r>
+        <w:rPr>
+          <w:rFonts w:ascii="Georgia" w:hAnsi="Georgia" w:cs="Georgia"/>
+          <w:b/>
+          <w:color w:val="A0522D"/>
+          <w:sz w:val="26"/>
+        </w:rPr>
+        <w:t>Gift Box Table (d20)</w:t>
+      </w:r>
+    </w:p>
+    <w:p>
+      <w:pPr>
+        <w:pBdr>
+          <w:left w:val="single" w:sz="18" w:space="12" w:color="5B2A86"/>
+        </w:pBdr>
+        <w:shd w:val="clear" w:color="auto" w:fill="F4F0FA"/>
+        <w:spacing w:before="30" w:after="70"/>
+        <w:ind w:left="340" w:right="340"/>
+      </w:pPr>
+      <w:r>
+        <w:rPr>
+          <w:rFonts w:ascii="Georgia" w:hAnsi="Georgia" w:cs="Georgia"/>
+          <w:b w:val="0"/>
+          <w:i w:val="0"/>
+          <w:color w:val="222222"/>
+          <w:sz w:val="19"/>
+        </w:rPr>
+        <w:t xml:space="preserve">▶ </w:t>
+      </w:r>
+      <w:r>
+        <w:rPr>
+          <w:rFonts w:ascii="Georgia" w:hAnsi="Georgia" w:cs="Georgia"/>
+          <w:b/>
+          <w:i w:val="0"/>
+          <w:color w:val="222222"/>
+          <w:sz w:val="19"/>
+        </w:rPr>
+        <w:t>Gift Boxes.</w:t>
+      </w:r>
+      <w:r>
+        <w:rPr>
+          <w:rFonts w:ascii="Georgia" w:hAnsi="Georgia" w:cs="Georgia"/>
+          <w:b w:val="0"/>
+          <w:i w:val="0"/>
+          <w:color w:val="222222"/>
+          <w:sz w:val="19"/>
+        </w:rPr>
+        <w:t xml:space="preserve"> When one of the Krampusshade's creatures is defeated, it leaves behind a wrapped gift box. Roll a d20 for its contents.</w:t>
+      </w:r>
+    </w:p>
+    <w:p>
+      <w:pPr>
+        <w:spacing w:after="80"/>
+      </w:pPr>
+      <w:r>
+        <w:rPr>
+          <w:rFonts w:ascii="Georgia" w:hAnsi="Georgia" w:cs="Georgia"/>
+          <w:b/>
+          <w:i w:val="0"/>
+          <w:color w:val="222222"/>
+          <w:sz w:val="21"/>
+        </w:rPr>
+        <w:t>1.</w:t>
+      </w:r>
+      <w:r>
+        <w:rPr>
+          <w:rFonts w:ascii="Georgia" w:hAnsi="Georgia" w:cs="Georgia"/>
+          <w:b w:val="0"/>
+          <w:i w:val="0"/>
+          <w:color w:val="222222"/>
+          <w:sz w:val="21"/>
+        </w:rPr>
+        <w:t xml:space="preserve"> Mimic in Disguise! The gift box is a tiny mimic (CR 1), and it immediately attacks.</w:t>
+      </w:r>
+    </w:p>
+    <w:p>
+      <w:pPr>
+        <w:spacing w:after="80"/>
+      </w:pPr>
+      <w:r>
+        <w:rPr>
+          <w:rFonts w:ascii="Georgia" w:hAnsi="Georgia" w:cs="Georgia"/>
+          <w:b/>
+          <w:i w:val="0"/>
+          <w:color w:val="222222"/>
+          <w:sz w:val="21"/>
+        </w:rPr>
+        <w:t>2-4.</w:t>
+      </w:r>
+      <w:r>
+        <w:rPr>
+          <w:rFonts w:ascii="Georgia" w:hAnsi="Georgia" w:cs="Georgia"/>
+          <w:b w:val="0"/>
+          <w:i w:val="0"/>
+          <w:color w:val="222222"/>
+          <w:sz w:val="21"/>
+        </w:rPr>
+        <w:t xml:space="preserve"> Lump of Coal: a mundane lump of coal. Slightly warm, but otherwise useless.</w:t>
+      </w:r>
+    </w:p>
+    <w:p>
+      <w:pPr>
+        <w:spacing w:after="80"/>
+      </w:pPr>
+      <w:r>
+        <w:rPr>
+          <w:rFonts w:ascii="Georgia" w:hAnsi="Georgia" w:cs="Georgia"/>
+          <w:b/>
+          <w:i w:val="0"/>
+          <w:color w:val="222222"/>
+          <w:sz w:val="21"/>
+        </w:rPr>
+        <w:t>5-6.</w:t>
+      </w:r>
+      <w:r>
+        <w:rPr>
+          <w:rFonts w:ascii="Georgia" w:hAnsi="Georgia" w:cs="Georgia"/>
+          <w:b w:val="0"/>
+          <w:i w:val="0"/>
+          <w:color w:val="222222"/>
+          <w:sz w:val="21"/>
+        </w:rPr>
+        <w:t xml:space="preserve"> Handful of Peppermint Shards: slightly refreshing. No mechanical effect.</w:t>
+      </w:r>
+    </w:p>
+    <w:p>
+      <w:pPr>
+        <w:spacing w:after="80"/>
+      </w:pPr>
+      <w:r>
+        <w:rPr>
+          <w:rFonts w:ascii="Georgia" w:hAnsi="Georgia" w:cs="Georgia"/>
+          <w:b/>
+          <w:i w:val="0"/>
+          <w:color w:val="222222"/>
+          <w:sz w:val="21"/>
+        </w:rPr>
+        <w:t>7-9.</w:t>
+      </w:r>
+      <w:r>
+        <w:rPr>
+          <w:rFonts w:ascii="Georgia" w:hAnsi="Georgia" w:cs="Georgia"/>
+          <w:b w:val="0"/>
+          <w:i w:val="0"/>
+          <w:color w:val="222222"/>
+          <w:sz w:val="21"/>
+        </w:rPr>
+        <w:t xml:space="preserve"> Gingerbread Cookie: a tasty treat that restores 1d4 hit points when eaten.</w:t>
+      </w:r>
+    </w:p>
+    <w:p>
+      <w:pPr>
+        <w:spacing w:after="80"/>
+      </w:pPr>
+      <w:r>
+        <w:rPr>
+          <w:rFonts w:ascii="Georgia" w:hAnsi="Georgia" w:cs="Georgia"/>
+          <w:b/>
+          <w:i w:val="0"/>
+          <w:color w:val="222222"/>
+          <w:sz w:val="21"/>
+        </w:rPr>
+        <w:t>10-12.</w:t>
+      </w:r>
+      <w:r>
+        <w:rPr>
+          <w:rFonts w:ascii="Georgia" w:hAnsi="Georgia" w:cs="Georgia"/>
+          <w:b w:val="0"/>
+          <w:i w:val="0"/>
+          <w:color w:val="222222"/>
+          <w:sz w:val="21"/>
+        </w:rPr>
+        <w:t xml:space="preserve"> Candy Cane Dagger: a simple weapon, 1d4 piercing damage. Melts after 24 hours.</w:t>
+      </w:r>
+    </w:p>
+    <w:p>
+      <w:pPr>
+        <w:spacing w:after="80"/>
+      </w:pPr>
+      <w:r>
+        <w:rPr>
+          <w:rFonts w:ascii="Georgia" w:hAnsi="Georgia" w:cs="Georgia"/>
+          <w:b/>
+          <w:i w:val="0"/>
+          <w:color w:val="222222"/>
+          <w:sz w:val="21"/>
+        </w:rPr>
+        <w:t>13-15.</w:t>
+      </w:r>
+      <w:r>
+        <w:rPr>
+          <w:rFonts w:ascii="Georgia" w:hAnsi="Georgia" w:cs="Georgia"/>
+          <w:b w:val="0"/>
+          <w:i w:val="0"/>
+          <w:color w:val="222222"/>
+          <w:sz w:val="21"/>
+        </w:rPr>
+        <w:t xml:space="preserve"> Hot Cocoa Flask: when drunk, grants resistance to cold damage for 1 hour.</w:t>
+      </w:r>
+    </w:p>
+    <w:p>
+      <w:pPr>
+        <w:spacing w:after="80"/>
+      </w:pPr>
+      <w:r>
+        <w:rPr>
+          <w:rFonts w:ascii="Georgia" w:hAnsi="Georgia" w:cs="Georgia"/>
+          <w:b/>
+          <w:i w:val="0"/>
+          <w:color w:val="222222"/>
+          <w:sz w:val="21"/>
+        </w:rPr>
+        <w:t>16-17.</w:t>
+      </w:r>
+      <w:r>
+        <w:rPr>
+          <w:rFonts w:ascii="Georgia" w:hAnsi="Georgia" w:cs="Georgia"/>
+          <w:b w:val="0"/>
+          <w:i w:val="0"/>
+          <w:color w:val="222222"/>
+          <w:sz w:val="21"/>
+        </w:rPr>
+        <w:t xml:space="preserve"> Sparkling Snow Globe: shaking it causes a harmless flurry of snow, and it sheds light for 30 feet.</w:t>
+      </w:r>
+    </w:p>
+    <w:p>
+      <w:pPr>
+        <w:spacing w:after="80"/>
+      </w:pPr>
+      <w:r>
+        <w:rPr>
+          <w:rFonts w:ascii="Georgia" w:hAnsi="Georgia" w:cs="Georgia"/>
+          <w:b/>
+          <w:i w:val="0"/>
+          <w:color w:val="222222"/>
+          <w:sz w:val="21"/>
+        </w:rPr>
+        <w:t>18-19.</w:t>
+      </w:r>
+      <w:r>
+        <w:rPr>
+          <w:rFonts w:ascii="Georgia" w:hAnsi="Georgia" w:cs="Georgia"/>
+          <w:b w:val="0"/>
+          <w:i w:val="0"/>
+          <w:color w:val="222222"/>
+          <w:sz w:val="21"/>
+        </w:rPr>
+        <w:t xml:space="preserve"> Frosted Cookie of Restoration: restores 2d8 hit points, grants the benefit of a short rest, and restores one spell slot.</w:t>
+      </w:r>
+    </w:p>
+    <w:p>
+      <w:pPr>
+        <w:spacing w:after="80"/>
+      </w:pPr>
+      <w:r>
+        <w:rPr>
+          <w:rFonts w:ascii="Georgia" w:hAnsi="Georgia" w:cs="Georgia"/>
+          <w:b/>
+          <w:i w:val="0"/>
+          <w:color w:val="222222"/>
+          <w:sz w:val="21"/>
+        </w:rPr>
+        <w:t>20.</w:t>
+      </w:r>
+      <w:r>
+        <w:rPr>
+          <w:rFonts w:ascii="Georgia" w:hAnsi="Georgia" w:cs="Georgia"/>
+          <w:b w:val="0"/>
+          <w:i w:val="0"/>
+          <w:color w:val="222222"/>
+          <w:sz w:val="21"/>
+        </w:rPr>
+        <w:t xml:space="preserve"> Holiday Miracle Charm: a small charm granting advantage on one saving throw within 24 hours.</w:t>
+      </w:r>
+    </w:p>
+    <w:p>
+      <w:pPr>
+        <w:keepNext/>
+        <w:spacing w:before="220" w:after="60"/>
+      </w:pPr>
+      <w:r>
+        <w:rPr>
+          <w:rFonts w:ascii="Georgia" w:hAnsi="Georgia" w:cs="Georgia"/>
+          <w:b/>
+          <w:color w:val="A0522D"/>
+          <w:sz w:val="26"/>
+        </w:rPr>
+        <w:t>The Yule Cat</w:t>
+      </w:r>
+    </w:p>
+    <w:p>
+      <w:pPr>
+        <w:spacing w:after="0" w:before="0"/>
+      </w:pPr>
+      <w:r>
+        <w:drawing>
+          <wp:anchor xmlns:a="http://schemas.openxmlformats.org/drawingml/2006/main" behindDoc="0" distT="0" distB="0" distL="114300" distR="0" simplePos="0" locked="0" layoutInCell="1" allowOverlap="1" relativeHeight="2">
+            <wp:simplePos x="0" y="0"/>
+            <wp:positionH relativeFrom="column">
+              <wp:align>right</wp:align>
+            </wp:positionH>
+            <wp:positionV relativeFrom="paragraph">
+              <wp:posOffset>0</wp:posOffset>
+            </wp:positionV>
+            <wp:extent cx="2057400" cy="2057400"/>
+            <wp:effectExtent l="0" t="0" r="0" b="0"/>
+            <wp:wrapSquare wrapText="bothSides"/>
+            <wp:docPr id="6" name="Picture 6"/>
+            <wp:cNvGraphicFramePr/>
+            <a:graphic xmlns:pic="http://schemas.openxmlformats.org/drawingml/2006/picture">
+              <a:graphicData uri="http://schemas.openxmlformats.org/drawingml/2006/picture">
+                <pic:pic>
+                  <pic:nvPicPr>
+                    <pic:cNvPr id="0" name="image.jpg"/>
+                    <pic:cNvPicPr/>
+                  </pic:nvPicPr>
+                  <pic:blipFill>
+                    <a:blip r:embed="rId15"/>
+                    <a:stretch>
+                      <a:fillRect/>
+                    </a:stretch>
+                  </pic:blipFill>
+                  <pic:spPr>
+                    <a:xfrm>
+                      <a:off x="0" y="0"/>
+                      <a:ext cx="2057400" cy="2057400"/>
+                    </a:xfrm>
+                    <a:prstGeom prst="rect"/>
+                  </pic:spPr>
+                </pic:pic>
+              </a:graphicData>
+            </a:graphic>
+          </wp:anchor>
+        </w:drawing>
+      </w:r>
+    </w:p>
+    <w:p>
+      <w:pPr>
+        <w:spacing w:after="80"/>
+      </w:pPr>
+      <w:r>
+        <w:rPr>
+          <w:rFonts w:ascii="Georgia" w:hAnsi="Georgia" w:cs="Georgia"/>
+          <w:b w:val="0"/>
+          <w:i w:val="0"/>
+          <w:color w:val="222222"/>
+          <w:sz w:val="21"/>
+        </w:rPr>
+        <w:t>A massive black feline with frost-covered fur and glowing yellow eyes, the Yule Cat is a creature of fey legend that judges those who lack generosity or kindness. It prowls the deep snow on silent paws, and a low growl through the cold air is the only warning before it pounces. Legends around Havenmoor say it circles the houses on festival nights, counting who has shared their supper and who has not.</w:t>
+      </w:r>
+    </w:p>
+    <w:p>
+      <w:pPr>
+        <w:pBdr>
+          <w:left w:val="single" w:sz="18" w:space="12" w:color="5B2A86"/>
+        </w:pBdr>
+        <w:shd w:val="clear" w:color="auto" w:fill="F4F0FA"/>
+        <w:spacing w:before="30" w:after="70"/>
+        <w:ind w:left="340" w:right="340"/>
+      </w:pPr>
+      <w:r>
+        <w:rPr>
+          <w:rFonts w:ascii="Georgia" w:hAnsi="Georgia" w:cs="Georgia"/>
+          <w:b w:val="0"/>
+          <w:i w:val="0"/>
+          <w:color w:val="222222"/>
+          <w:sz w:val="19"/>
+        </w:rPr>
+        <w:t xml:space="preserve">▶ </w:t>
+      </w:r>
+      <w:r>
+        <w:rPr>
+          <w:rFonts w:ascii="Georgia" w:hAnsi="Georgia" w:cs="Georgia"/>
+          <w:b/>
+          <w:i w:val="0"/>
+          <w:color w:val="222222"/>
+          <w:sz w:val="19"/>
+        </w:rPr>
+        <w:t>Yule Cat (CR 3).</w:t>
+      </w:r>
+      <w:r>
+        <w:rPr>
+          <w:rFonts w:ascii="Georgia" w:hAnsi="Georgia" w:cs="Georgia"/>
+          <w:b w:val="0"/>
+          <w:i w:val="0"/>
+          <w:color w:val="222222"/>
+          <w:sz w:val="19"/>
+        </w:rPr>
+        <w:t xml:space="preserve"> Wisdom (Animal Handling) DC 15 calms it for a round; Wisdom (Insight) DC 14 reveals that it seeks acts of generosity, so offering food or gifts can delay its attack entirely. In a fight it relies on Frost Claw, a Frostbite Pounce that knocks heroes prone, and a Chilling Gaze (DC 14 Constitution) that paralyzes with cold. Win or appease it, and a roll on the Gift Box Table follows.</w:t>
+      </w:r>
+    </w:p>
+    <w:p>
+      <w:pPr>
+        <w:keepNext/>
+        <w:spacing w:before="220" w:after="60"/>
+      </w:pPr>
+      <w:r>
+        <w:rPr>
+          <w:rFonts w:ascii="Georgia" w:hAnsi="Georgia" w:cs="Georgia"/>
+          <w:b/>
+          <w:color w:val="A0522D"/>
+          <w:sz w:val="26"/>
+        </w:rPr>
+        <w:t>The Frost Hag</w:t>
+      </w:r>
+    </w:p>
+    <w:p>
+      <w:pPr>
+        <w:spacing w:after="0" w:before="0"/>
+      </w:pPr>
+      <w:r>
+        <w:drawing>
+          <wp:anchor xmlns:a="http://schemas.openxmlformats.org/drawingml/2006/main" behindDoc="0" distT="0" distB="0" distL="114300" distR="0" simplePos="0" locked="0" layoutInCell="1" allowOverlap="1" relativeHeight="2">
+            <wp:simplePos x="0" y="0"/>
+            <wp:positionH relativeFrom="column">
+              <wp:align>right</wp:align>
+            </wp:positionH>
+            <wp:positionV relativeFrom="paragraph">
+              <wp:posOffset>0</wp:posOffset>
+            </wp:positionV>
+            <wp:extent cx="2057400" cy="2057400"/>
+            <wp:effectExtent l="0" t="0" r="0" b="0"/>
+            <wp:wrapSquare wrapText="bothSides"/>
+            <wp:docPr id="7" name="Picture 7"/>
+            <wp:cNvGraphicFramePr/>
+            <a:graphic xmlns:pic="http://schemas.openxmlformats.org/drawingml/2006/picture">
+              <a:graphicData uri="http://schemas.openxmlformats.org/drawingml/2006/picture">
+                <pic:pic>
+                  <pic:nvPicPr>
+                    <pic:cNvPr id="0" name="image.jpg"/>
+                    <pic:cNvPicPr/>
+                  </pic:nvPicPr>
+                  <pic:blipFill>
+                    <a:blip r:embed="rId16"/>
+                    <a:stretch>
+                      <a:fillRect/>
+                    </a:stretch>
+                  </pic:blipFill>
+                  <pic:spPr>
+                    <a:xfrm>
+                      <a:off x="0" y="0"/>
+                      <a:ext cx="2057400" cy="2057400"/>
+                    </a:xfrm>
+                    <a:prstGeom prst="rect"/>
+                  </pic:spPr>
+                </pic:pic>
+              </a:graphicData>
+            </a:graphic>
+          </wp:anchor>
+        </w:drawing>
+      </w:r>
+    </w:p>
+    <w:p>
+      <w:pPr>
+        <w:spacing w:after="80"/>
+      </w:pPr>
+      <w:r>
+        <w:rPr>
+          <w:rFonts w:ascii="Georgia" w:hAnsi="Georgia" w:cs="Georgia"/>
+          <w:b w:val="0"/>
+          <w:i w:val="0"/>
+          <w:color w:val="222222"/>
+          <w:sz w:val="21"/>
+        </w:rPr>
+        <w:t>In a lonely clearing, a kindly old woman tends a bubbling cauldron and waves travelers over to warm themselves and share pastries dusted with powdered sugar. Her voice is honey and her fire is warm, but her eyes glint far too coldly for the warmth of her smile. The wisest travelers notice that no snow melts anywhere near her fire.</w:t>
+      </w:r>
+    </w:p>
+    <w:p>
+      <w:pPr>
+        <w:pBdr>
+          <w:left w:val="single" w:sz="18" w:space="12" w:color="5B2A86"/>
+        </w:pBdr>
+        <w:shd w:val="clear" w:color="auto" w:fill="F4F0FA"/>
+        <w:spacing w:before="30" w:after="70"/>
+        <w:ind w:left="340" w:right="340"/>
+      </w:pPr>
+      <w:r>
+        <w:rPr>
+          <w:rFonts w:ascii="Georgia" w:hAnsi="Georgia" w:cs="Georgia"/>
+          <w:b w:val="0"/>
+          <w:i w:val="0"/>
+          <w:color w:val="222222"/>
+          <w:sz w:val="19"/>
+        </w:rPr>
+        <w:t xml:space="preserve">▶ </w:t>
+      </w:r>
+      <w:r>
+        <w:rPr>
+          <w:rFonts w:ascii="Georgia" w:hAnsi="Georgia" w:cs="Georgia"/>
+          <w:b/>
+          <w:i w:val="0"/>
+          <w:color w:val="222222"/>
+          <w:sz w:val="19"/>
+        </w:rPr>
+        <w:t>Frost Hag (CR 4).</w:t>
+      </w:r>
+      <w:r>
+        <w:rPr>
+          <w:rFonts w:ascii="Georgia" w:hAnsi="Georgia" w:cs="Georgia"/>
+          <w:b w:val="0"/>
+          <w:i w:val="0"/>
+          <w:color w:val="222222"/>
+          <w:sz w:val="19"/>
+        </w:rPr>
+        <w:t xml:space="preserve"> Wisdom (Insight) DC 14 catches the malice behind the smile. Anyone who eats her treats must make a DC 13 Constitution save or be poisoned for 1 hour, taking 1d4 cold damage. Unmasked, she is ice-crusted skin and jagged teeth: Icy Claw, a 15-foot Frostbite Breath cone (DC 14 Constitution, 4d6 cold, slowed on a failure), and Misty Step as a bonus action to keep out of reach.</w:t>
+      </w:r>
+    </w:p>
+    <w:p>
+      <w:pPr>
+        <w:keepNext/>
+        <w:spacing w:before="220" w:after="60"/>
+      </w:pPr>
+      <w:r>
+        <w:rPr>
+          <w:rFonts w:ascii="Georgia" w:hAnsi="Georgia" w:cs="Georgia"/>
+          <w:b/>
+          <w:color w:val="A0522D"/>
+          <w:sz w:val="26"/>
+        </w:rPr>
+        <w:t>Snowbound Bandits</w:t>
+      </w:r>
+    </w:p>
+    <w:p>
+      <w:pPr>
+        <w:spacing w:after="0" w:before="0"/>
+      </w:pPr>
+      <w:r>
+        <w:drawing>
+          <wp:anchor xmlns:a="http://schemas.openxmlformats.org/drawingml/2006/main" behindDoc="0" distT="0" distB="0" distL="114300" distR="0" simplePos="0" locked="0" layoutInCell="1" allowOverlap="1" relativeHeight="2">
+            <wp:simplePos x="0" y="0"/>
+            <wp:positionH relativeFrom="column">
+              <wp:align>right</wp:align>
+            </wp:positionH>
+            <wp:positionV relativeFrom="paragraph">
+              <wp:posOffset>0</wp:posOffset>
+            </wp:positionV>
+            <wp:extent cx="2057400" cy="2057400"/>
+            <wp:effectExtent l="0" t="0" r="0" b="0"/>
+            <wp:wrapSquare wrapText="bothSides"/>
+            <wp:docPr id="8" name="Picture 8"/>
+            <wp:cNvGraphicFramePr/>
+            <a:graphic xmlns:pic="http://schemas.openxmlformats.org/drawingml/2006/picture">
+              <a:graphicData uri="http://schemas.openxmlformats.org/drawingml/2006/picture">
+                <pic:pic>
+                  <pic:nvPicPr>
+                    <pic:cNvPr id="0" name="image.jpg"/>
+                    <pic:cNvPicPr/>
+                  </pic:nvPicPr>
+                  <pic:blipFill>
+                    <a:blip r:embed="rId17"/>
+                    <a:stretch>
+                      <a:fillRect/>
+                    </a:stretch>
+                  </pic:blipFill>
+                  <pic:spPr>
+                    <a:xfrm>
+                      <a:off x="0" y="0"/>
+                      <a:ext cx="2057400" cy="2057400"/>
+                    </a:xfrm>
+                    <a:prstGeom prst="rect"/>
+                  </pic:spPr>
+                </pic:pic>
+              </a:graphicData>
+            </a:graphic>
+          </wp:anchor>
+        </w:drawing>
+      </w:r>
+    </w:p>
+    <w:p>
+      <w:pPr>
+        <w:spacing w:after="80"/>
+      </w:pPr>
+      <w:r>
+        <w:rPr>
+          <w:rFonts w:ascii="Georgia" w:hAnsi="Georgia" w:cs="Georgia"/>
+          <w:b w:val="0"/>
+          <w:i w:val="0"/>
+          <w:color w:val="222222"/>
+          <w:sz w:val="21"/>
+        </w:rPr>
+        <w:t>On a narrow, snow-choked path, four desperate figures rise out of the drifts with weapons trembling in frostbitten hands, and a grizzled leader with a frost-crusted beard demands the party's packs. They are cold and hungry rather than wicked, and a warm meal buys more peace than a drawn blade. A DM with a soft heart may let a fed and warmed bandit whisper a useful rumor about the roads before the band slips away into the snow.</w:t>
+      </w:r>
+    </w:p>
+    <w:p>
+      <w:pPr>
+        <w:pBdr>
+          <w:left w:val="single" w:sz="18" w:space="12" w:color="5B2A86"/>
+        </w:pBdr>
+        <w:shd w:val="clear" w:color="auto" w:fill="F4F0FA"/>
+        <w:spacing w:before="30" w:after="70"/>
+        <w:ind w:left="340" w:right="340"/>
+      </w:pPr>
+      <w:r>
+        <w:rPr>
+          <w:rFonts w:ascii="Georgia" w:hAnsi="Georgia" w:cs="Georgia"/>
+          <w:b w:val="0"/>
+          <w:i w:val="0"/>
+          <w:color w:val="222222"/>
+          <w:sz w:val="19"/>
+        </w:rPr>
+        <w:t xml:space="preserve">▶ </w:t>
+      </w:r>
+      <w:r>
+        <w:rPr>
+          <w:rFonts w:ascii="Georgia" w:hAnsi="Georgia" w:cs="Georgia"/>
+          <w:b/>
+          <w:i w:val="0"/>
+          <w:color w:val="222222"/>
+          <w:sz w:val="19"/>
+        </w:rPr>
+        <w:t>3 Bandits and 1 Bandit Leader.</w:t>
+      </w:r>
+      <w:r>
+        <w:rPr>
+          <w:rFonts w:ascii="Georgia" w:hAnsi="Georgia" w:cs="Georgia"/>
+          <w:b w:val="0"/>
+          <w:i w:val="0"/>
+          <w:color w:val="222222"/>
+          <w:sz w:val="19"/>
+        </w:rPr>
+        <w:t xml:space="preserve"> Wisdom (Insight) DC 14 shows they are driven by desperation, not malice. Charisma (Persuasion) DC 15 with an offer of food or warmth avoids the fight; Intimidation DC 14 scares them into retreat, but failure means combat on slippery ice (Dexterity DC 13 to move more than 15 feet without falling prone). The leader's Frostbite Strike adds 1d6 cold damage and can slow its target. Victory yields 1d4 healing potions, 10 gold, rations for two days, and a Gift Box.</w:t>
+      </w:r>
+    </w:p>
+    <w:p>
+      <w:pPr>
+        <w:keepNext/>
+        <w:spacing w:before="220" w:after="60"/>
+      </w:pPr>
+      <w:r>
+        <w:rPr>
+          <w:rFonts w:ascii="Georgia" w:hAnsi="Georgia" w:cs="Georgia"/>
+          <w:b/>
+          <w:color w:val="A0522D"/>
+          <w:sz w:val="26"/>
+        </w:rPr>
+        <w:t>Frost Golems</w:t>
+      </w:r>
+    </w:p>
+    <w:p>
+      <w:pPr>
+        <w:spacing w:after="0" w:before="0"/>
+      </w:pPr>
+      <w:r>
+        <w:drawing>
+          <wp:anchor xmlns:a="http://schemas.openxmlformats.org/drawingml/2006/main" behindDoc="0" distT="0" distB="0" distL="114300" distR="0" simplePos="0" locked="0" layoutInCell="1" allowOverlap="1" relativeHeight="2">
+            <wp:simplePos x="0" y="0"/>
+            <wp:positionH relativeFrom="column">
+              <wp:align>right</wp:align>
+            </wp:positionH>
+            <wp:positionV relativeFrom="paragraph">
+              <wp:posOffset>0</wp:posOffset>
+            </wp:positionV>
+            <wp:extent cx="2057400" cy="2057400"/>
+            <wp:effectExtent l="0" t="0" r="0" b="0"/>
+            <wp:wrapSquare wrapText="bothSides"/>
+            <wp:docPr id="9" name="Picture 9"/>
+            <wp:cNvGraphicFramePr/>
+            <a:graphic xmlns:pic="http://schemas.openxmlformats.org/drawingml/2006/picture">
+              <a:graphicData uri="http://schemas.openxmlformats.org/drawingml/2006/picture">
+                <pic:pic>
+                  <pic:nvPicPr>
+                    <pic:cNvPr id="0" name="image.jpg"/>
+                    <pic:cNvPicPr/>
+                  </pic:nvPicPr>
+                  <pic:blipFill>
+                    <a:blip r:embed="rId18"/>
+                    <a:stretch>
+                      <a:fillRect/>
+                    </a:stretch>
+                  </pic:blipFill>
+                  <pic:spPr>
+                    <a:xfrm>
+                      <a:off x="0" y="0"/>
+                      <a:ext cx="2057400" cy="2057400"/>
+                    </a:xfrm>
+                    <a:prstGeom prst="rect"/>
+                  </pic:spPr>
+                </pic:pic>
+              </a:graphicData>
+            </a:graphic>
+          </wp:anchor>
+        </w:drawing>
+      </w:r>
+    </w:p>
+    <w:p>
+      <w:pPr>
+        <w:spacing w:after="80"/>
+      </w:pPr>
+      <w:r>
+        <w:rPr>
+          <w:rFonts w:ascii="Georgia" w:hAnsi="Georgia" w:cs="Georgia"/>
+          <w:b w:val="0"/>
+          <w:i w:val="0"/>
+          <w:color w:val="222222"/>
+          <w:sz w:val="21"/>
+        </w:rPr>
+        <w:t>On a serene snowfield, the powder suddenly trembles and pulls itself together, packing into two jagged shapes of snow and ice shard. Their eyes glow with an eerie blue light as they lumber forward, frost radiating from their bodies, without hurry and without mercy.</w:t>
+      </w:r>
+    </w:p>
+    <w:p>
+      <w:pPr>
+        <w:pBdr>
+          <w:left w:val="single" w:sz="18" w:space="12" w:color="5B2A86"/>
+        </w:pBdr>
+        <w:shd w:val="clear" w:color="auto" w:fill="F4F0FA"/>
+        <w:spacing w:before="30" w:after="70"/>
+        <w:ind w:left="340" w:right="340"/>
+      </w:pPr>
+      <w:r>
+        <w:rPr>
+          <w:rFonts w:ascii="Georgia" w:hAnsi="Georgia" w:cs="Georgia"/>
+          <w:b w:val="0"/>
+          <w:i w:val="0"/>
+          <w:color w:val="222222"/>
+          <w:sz w:val="19"/>
+        </w:rPr>
+        <w:t xml:space="preserve">▶ </w:t>
+      </w:r>
+      <w:r>
+        <w:rPr>
+          <w:rFonts w:ascii="Georgia" w:hAnsi="Georgia" w:cs="Georgia"/>
+          <w:b/>
+          <w:i w:val="0"/>
+          <w:color w:val="222222"/>
+          <w:sz w:val="19"/>
+        </w:rPr>
+        <w:t>2 Frost Golems (CR 2 each).</w:t>
+      </w:r>
+      <w:r>
+        <w:rPr>
+          <w:rFonts w:ascii="Georgia" w:hAnsi="Georgia" w:cs="Georgia"/>
+          <w:b w:val="0"/>
+          <w:i w:val="0"/>
+          <w:color w:val="222222"/>
+          <w:sz w:val="19"/>
+        </w:rPr>
+        <w:t xml:space="preserve"> Icy Slam (2d6 + 3 bludgeoning plus 1d4 cold) and a Frost Aura that deals 2 cold damage at the start of each creature's turn within 5 feet. The snowfield itself is a hazard: Dexterity (Acrobatics) DC 14 to move quickly without falling prone. The golems trudge relentlessly and try to corner heroes on the worst of the ice.</w:t>
+      </w:r>
+    </w:p>
+    <w:p>
+      <w:pPr>
+        <w:keepNext/>
+        <w:spacing w:before="220" w:after="60"/>
+      </w:pPr>
+      <w:r>
+        <w:rPr>
+          <w:rFonts w:ascii="Georgia" w:hAnsi="Georgia" w:cs="Georgia"/>
+          <w:b/>
+          <w:color w:val="A0522D"/>
+          <w:sz w:val="26"/>
+        </w:rPr>
+        <w:t>Enchanted Snowmen</w:t>
+      </w:r>
+    </w:p>
+    <w:p>
+      <w:pPr>
+        <w:spacing w:after="0" w:before="0"/>
+      </w:pPr>
+      <w:r>
+        <w:drawing>
+          <wp:anchor xmlns:a="http://schemas.openxmlformats.org/drawingml/2006/main" behindDoc="0" distT="0" distB="0" distL="114300" distR="0" simplePos="0" locked="0" layoutInCell="1" allowOverlap="1" relativeHeight="2">
+            <wp:simplePos x="0" y="0"/>
+            <wp:positionH relativeFrom="column">
+              <wp:align>right</wp:align>
+            </wp:positionH>
+            <wp:positionV relativeFrom="paragraph">
+              <wp:posOffset>0</wp:posOffset>
+            </wp:positionV>
+            <wp:extent cx="2057400" cy="2057400"/>
+            <wp:effectExtent l="0" t="0" r="0" b="0"/>
+            <wp:wrapSquare wrapText="bothSides"/>
+            <wp:docPr id="10" name="Picture 10"/>
+            <wp:cNvGraphicFramePr/>
+            <a:graphic xmlns:pic="http://schemas.openxmlformats.org/drawingml/2006/picture">
+              <a:graphicData uri="http://schemas.openxmlformats.org/drawingml/2006/picture">
+                <pic:pic>
+                  <pic:nvPicPr>
+                    <pic:cNvPr id="0" name="image.jpg"/>
+                    <pic:cNvPicPr/>
+                  </pic:nvPicPr>
+                  <pic:blipFill>
+                    <a:blip r:embed="rId19"/>
+                    <a:stretch>
+                      <a:fillRect/>
+                    </a:stretch>
+                  </pic:blipFill>
+                  <pic:spPr>
+                    <a:xfrm>
+                      <a:off x="0" y="0"/>
+                      <a:ext cx="2057400" cy="2057400"/>
+                    </a:xfrm>
+                    <a:prstGeom prst="rect"/>
+                  </pic:spPr>
+                </pic:pic>
+              </a:graphicData>
+            </a:graphic>
+          </wp:anchor>
+        </w:drawing>
+      </w:r>
+    </w:p>
+    <w:p>
+      <w:pPr>
+        <w:spacing w:after="80"/>
+      </w:pPr>
+      <w:r>
+        <w:rPr>
+          <w:rFonts w:ascii="Georgia" w:hAnsi="Georgia" w:cs="Georgia"/>
+          <w:b w:val="0"/>
+          <w:i w:val="0"/>
+          <w:color w:val="222222"/>
+          <w:sz w:val="21"/>
+        </w:rPr>
+        <w:t>Three cheerful roadside snowmen with coal-black eyes and wicked twig grins shudder to life as travelers pass, stick arms lifting to pelt them with snowballs laced with ice magic. It would almost be funny, if the snowballs did not hit quite so hard.</w:t>
+      </w:r>
+    </w:p>
+    <w:p>
+      <w:pPr>
+        <w:pBdr>
+          <w:left w:val="single" w:sz="18" w:space="12" w:color="5B2A86"/>
+        </w:pBdr>
+        <w:shd w:val="clear" w:color="auto" w:fill="F4F0FA"/>
+        <w:spacing w:before="30" w:after="70"/>
+        <w:ind w:left="340" w:right="340"/>
+      </w:pPr>
+      <w:r>
+        <w:rPr>
+          <w:rFonts w:ascii="Georgia" w:hAnsi="Georgia" w:cs="Georgia"/>
+          <w:b w:val="0"/>
+          <w:i w:val="0"/>
+          <w:color w:val="222222"/>
+          <w:sz w:val="19"/>
+        </w:rPr>
+        <w:t xml:space="preserve">▶ </w:t>
+      </w:r>
+      <w:r>
+        <w:rPr>
+          <w:rFonts w:ascii="Georgia" w:hAnsi="Georgia" w:cs="Georgia"/>
+          <w:b/>
+          <w:i w:val="0"/>
+          <w:color w:val="222222"/>
+          <w:sz w:val="19"/>
+        </w:rPr>
+        <w:t>3 Enchanted Snowmen (CR 1 each).</w:t>
+      </w:r>
+      <w:r>
+        <w:rPr>
+          <w:rFonts w:ascii="Georgia" w:hAnsi="Georgia" w:cs="Georgia"/>
+          <w:b w:val="0"/>
+          <w:i w:val="0"/>
+          <w:color w:val="222222"/>
+          <w:sz w:val="19"/>
+        </w:rPr>
+        <w:t xml:space="preserve"> Wisdom (Perception) DC 14 to act before the snowmen do. Frostball: +4 to hit, 2d4 cold damage, and a DC 12 Constitution save or the target's speed is halved until the end of its next turn. AC 13, HP 30, and they never stop grinning.</w:t>
+      </w:r>
+    </w:p>
+    <w:p>
+      <w:pPr>
+        <w:keepNext/>
+        <w:spacing w:before="220" w:after="60"/>
+      </w:pPr>
+      <w:r>
+        <w:rPr>
+          <w:rFonts w:ascii="Georgia" w:hAnsi="Georgia" w:cs="Georgia"/>
+          <w:b/>
+          <w:color w:val="A0522D"/>
+          <w:sz w:val="26"/>
+        </w:rPr>
+        <w:t>Ice Spiders</w:t>
+      </w:r>
+    </w:p>
+    <w:p>
+      <w:pPr>
+        <w:spacing w:after="0" w:before="0"/>
+      </w:pPr>
+      <w:r>
+        <w:drawing>
+          <wp:anchor xmlns:a="http://schemas.openxmlformats.org/drawingml/2006/main" behindDoc="0" distT="0" distB="0" distL="114300" distR="0" simplePos="0" locked="0" layoutInCell="1" allowOverlap="1" relativeHeight="2">
+            <wp:simplePos x="0" y="0"/>
+            <wp:positionH relativeFrom="column">
+              <wp:align>right</wp:align>
+            </wp:positionH>
+            <wp:positionV relativeFrom="paragraph">
+              <wp:posOffset>0</wp:posOffset>
+            </wp:positionV>
+            <wp:extent cx="2057400" cy="2057400"/>
+            <wp:effectExtent l="0" t="0" r="0" b="0"/>
+            <wp:wrapSquare wrapText="bothSides"/>
+            <wp:docPr id="11" name="Picture 11"/>
+            <wp:cNvGraphicFramePr/>
+            <a:graphic xmlns:pic="http://schemas.openxmlformats.org/drawingml/2006/picture">
+              <a:graphicData uri="http://schemas.openxmlformats.org/drawingml/2006/picture">
+                <pic:pic>
+                  <pic:nvPicPr>
+                    <pic:cNvPr id="0" name="image.jpg"/>
+                    <pic:cNvPicPr/>
+                  </pic:nvPicPr>
+                  <pic:blipFill>
+                    <a:blip r:embed="rId20"/>
+                    <a:stretch>
+                      <a:fillRect/>
+                    </a:stretch>
+                  </pic:blipFill>
+                  <pic:spPr>
+                    <a:xfrm>
+                      <a:off x="0" y="0"/>
+                      <a:ext cx="2057400" cy="2057400"/>
+                    </a:xfrm>
+                    <a:prstGeom prst="rect"/>
+                  </pic:spPr>
+                </pic:pic>
+              </a:graphicData>
+            </a:graphic>
+          </wp:anchor>
+        </w:drawing>
+      </w:r>
+    </w:p>
+    <w:p>
+      <w:pPr>
+        <w:spacing w:after="80"/>
+      </w:pPr>
+      <w:r>
+        <w:rPr>
+          <w:rFonts w:ascii="Georgia" w:hAnsi="Georgia" w:cs="Georgia"/>
+          <w:b w:val="0"/>
+          <w:i w:val="0"/>
+          <w:color w:val="222222"/>
+          <w:sz w:val="21"/>
+        </w:rPr>
+        <w:t>In a grove of frost-covered trees, branches creak under an unnatural weight and a faint skittering echoes overhead. Then icy webs glisten in the dappled light, and frost-coated spiders the size of wolves drop from the canopy, mandibles glittering with rime.</w:t>
+      </w:r>
+    </w:p>
+    <w:p>
+      <w:pPr>
+        <w:pBdr>
+          <w:left w:val="single" w:sz="18" w:space="12" w:color="5B2A86"/>
+        </w:pBdr>
+        <w:shd w:val="clear" w:color="auto" w:fill="F4F0FA"/>
+        <w:spacing w:before="30" w:after="70"/>
+        <w:ind w:left="340" w:right="340"/>
+      </w:pPr>
+      <w:r>
+        <w:rPr>
+          <w:rFonts w:ascii="Georgia" w:hAnsi="Georgia" w:cs="Georgia"/>
+          <w:b w:val="0"/>
+          <w:i w:val="0"/>
+          <w:color w:val="222222"/>
+          <w:sz w:val="19"/>
+        </w:rPr>
+        <w:t xml:space="preserve">▶ </w:t>
+      </w:r>
+      <w:r>
+        <w:rPr>
+          <w:rFonts w:ascii="Georgia" w:hAnsi="Georgia" w:cs="Georgia"/>
+          <w:b/>
+          <w:i w:val="0"/>
+          <w:color w:val="222222"/>
+          <w:sz w:val="19"/>
+        </w:rPr>
+        <w:t>2d6 Ice Spiders (CR 1 each).</w:t>
+      </w:r>
+      <w:r>
+        <w:rPr>
+          <w:rFonts w:ascii="Georgia" w:hAnsi="Georgia" w:cs="Georgia"/>
+          <w:b w:val="0"/>
+          <w:i w:val="0"/>
+          <w:color w:val="222222"/>
+          <w:sz w:val="19"/>
+        </w:rPr>
+        <w:t xml:space="preserve"> Wisdom (Perception) DC 15 spots them before they drop; Wisdom (Survival) DC 14 keeps the party out of the sticky web traps (DC 13 Strength to break free). Their bite carries a venomous chill (DC 13 Constitution or poisoned 1 minute), their frozen webbing stings for 1d4 cold damage if touched, and the ground beneath the grove is slick ice, Dexterity (Acrobatics) DC 14 to keep footing.</w:t>
+      </w:r>
+    </w:p>
+    <w:p>
+      <w:pPr>
+        <w:keepNext/>
+        <w:spacing w:before="220" w:after="60"/>
+      </w:pPr>
+      <w:r>
+        <w:rPr>
+          <w:rFonts w:ascii="Georgia" w:hAnsi="Georgia" w:cs="Georgia"/>
+          <w:b/>
+          <w:color w:val="A0522D"/>
+          <w:sz w:val="26"/>
+        </w:rPr>
+        <w:t>Tricks of the Road</w:t>
+      </w:r>
+    </w:p>
+    <w:p>
+      <w:pPr>
+        <w:pBdr>
+          <w:left w:val="single" w:sz="18" w:space="12" w:color="5B2A86"/>
+        </w:pBdr>
+        <w:shd w:val="clear" w:color="auto" w:fill="F4F0FA"/>
+        <w:spacing w:before="30" w:after="70"/>
+        <w:ind w:left="340" w:right="340"/>
+      </w:pPr>
+      <w:r>
+        <w:rPr>
+          <w:rFonts w:ascii="Georgia" w:hAnsi="Georgia" w:cs="Georgia"/>
+          <w:b w:val="0"/>
+          <w:i w:val="0"/>
+          <w:color w:val="222222"/>
+          <w:sz w:val="19"/>
+        </w:rPr>
+        <w:t xml:space="preserve">▶ </w:t>
+      </w:r>
+      <w:r>
+        <w:rPr>
+          <w:rFonts w:ascii="Georgia" w:hAnsi="Georgia" w:cs="Georgia"/>
+          <w:b/>
+          <w:i w:val="0"/>
+          <w:color w:val="222222"/>
+          <w:sz w:val="19"/>
+        </w:rPr>
+        <w:t>Blizzard Trap.</w:t>
+      </w:r>
+      <w:r>
+        <w:rPr>
+          <w:rFonts w:ascii="Georgia" w:hAnsi="Georgia" w:cs="Georgia"/>
+          <w:b w:val="0"/>
+          <w:i w:val="0"/>
+          <w:color w:val="222222"/>
+          <w:sz w:val="19"/>
+        </w:rPr>
+        <w:t xml:space="preserve"> The wind rises and the world goes white. Wisdom (Survival) DC 14 finds the way through to a small sheltered grove where the party can rest and warm up; failure means an hour lost in the storm and 1d6 cold damage from exposure.</w:t>
+      </w:r>
+    </w:p>
+    <w:p>
+      <w:pPr>
+        <w:pBdr>
+          <w:left w:val="single" w:sz="18" w:space="12" w:color="5B2A86"/>
+        </w:pBdr>
+        <w:shd w:val="clear" w:color="auto" w:fill="F4F0FA"/>
+        <w:spacing w:before="30" w:after="70"/>
+        <w:ind w:left="340" w:right="340"/>
+      </w:pPr>
+      <w:r>
+        <w:rPr>
+          <w:rFonts w:ascii="Georgia" w:hAnsi="Georgia" w:cs="Georgia"/>
+          <w:b w:val="0"/>
+          <w:i w:val="0"/>
+          <w:color w:val="222222"/>
+          <w:sz w:val="19"/>
+        </w:rPr>
+        <w:t xml:space="preserve">▶ </w:t>
+      </w:r>
+      <w:r>
+        <w:rPr>
+          <w:rFonts w:ascii="Georgia" w:hAnsi="Georgia" w:cs="Georgia"/>
+          <w:b/>
+          <w:i w:val="0"/>
+          <w:color w:val="222222"/>
+          <w:sz w:val="19"/>
+        </w:rPr>
+        <w:t>Holiday Illusions.</w:t>
+      </w:r>
+      <w:r>
+        <w:rPr>
+          <w:rFonts w:ascii="Georgia" w:hAnsi="Georgia" w:cs="Georgia"/>
+          <w:b w:val="0"/>
+          <w:i w:val="0"/>
+          <w:color w:val="222222"/>
+          <w:sz w:val="19"/>
+        </w:rPr>
+        <w:t xml:space="preserve"> A vision of a warmly lit cabin unfolds, all laughter, glowing lanterns, roasted chestnuts, and spiced cider. Intelligence (Arcana) or (Investigation) DC 15 spots the flickering seams. Those who walk in take 1d4 psychic damage as the vision shatters over a deep snow drift: DC 13 Dexterity save or become trapped and take 1d6 cold damage, then DC 14 Constitution save or gain a level of exhaustion. Seeing through the trick earns a brief warmth, a protective charm against illusions for the next hour.</w:t>
+      </w:r>
+    </w:p>
+    <w:p>
+      <w:pPr>
+        <w:pBdr>
+          <w:left w:val="single" w:sz="18" w:space="12" w:color="5B2A86"/>
+        </w:pBdr>
+        <w:shd w:val="clear" w:color="auto" w:fill="F4F0FA"/>
+        <w:spacing w:before="30" w:after="70"/>
+        <w:ind w:left="340" w:right="340"/>
+      </w:pPr>
+      <w:r>
+        <w:rPr>
+          <w:rFonts w:ascii="Georgia" w:hAnsi="Georgia" w:cs="Georgia"/>
+          <w:b w:val="0"/>
+          <w:i w:val="0"/>
+          <w:color w:val="222222"/>
+          <w:sz w:val="19"/>
+        </w:rPr>
+        <w:t xml:space="preserve">▶ </w:t>
+      </w:r>
+      <w:r>
+        <w:rPr>
+          <w:rFonts w:ascii="Georgia" w:hAnsi="Georgia" w:cs="Georgia"/>
+          <w:b/>
+          <w:i w:val="0"/>
+          <w:color w:val="222222"/>
+          <w:sz w:val="19"/>
+        </w:rPr>
+        <w:t>Mimic in Disguise.</w:t>
+      </w:r>
+      <w:r>
+        <w:rPr>
+          <w:rFonts w:ascii="Georgia" w:hAnsi="Georgia" w:cs="Georgia"/>
+          <w:b w:val="0"/>
+          <w:i w:val="0"/>
+          <w:color w:val="222222"/>
+          <w:sz w:val="19"/>
+        </w:rPr>
+        <w:t xml:space="preserve"> The prettiest gift box on the road is sometimes a tiny mimic, all teeth and adhesive. Its bigger cousin (CR 2, AC 12, HP 58, bite plus 1d8 acid, DC 13 Strength to escape its grip) waits in the bestiary compendium for DMs feeling festive.</w:t>
+      </w:r>
+    </w:p>
+    <w:p>
+      <w:pPr>
+        <w:keepNext/>
+        <w:spacing w:before="220" w:after="60"/>
+      </w:pPr>
+      <w:r>
+        <w:rPr>
+          <w:rFonts w:ascii="Georgia" w:hAnsi="Georgia" w:cs="Georgia"/>
+          <w:b/>
+          <w:color w:val="A0522D"/>
+          <w:sz w:val="26"/>
+        </w:rPr>
+        <w:t>Frozen Will-o'-Wisps</w:t>
+      </w:r>
+    </w:p>
+    <w:p>
+      <w:pPr>
+        <w:spacing w:after="0" w:before="0"/>
+      </w:pPr>
+      <w:r>
+        <w:drawing>
+          <wp:anchor xmlns:a="http://schemas.openxmlformats.org/drawingml/2006/main" behindDoc="0" distT="0" distB="0" distL="114300" distR="0" simplePos="0" locked="0" layoutInCell="1" allowOverlap="1" relativeHeight="2">
+            <wp:simplePos x="0" y="0"/>
+            <wp:positionH relativeFrom="column">
+              <wp:align>right</wp:align>
+            </wp:positionH>
+            <wp:positionV relativeFrom="paragraph">
+              <wp:posOffset>0</wp:posOffset>
+            </wp:positionV>
+            <wp:extent cx="2057400" cy="2057400"/>
+            <wp:effectExtent l="0" t="0" r="0" b="0"/>
+            <wp:wrapSquare wrapText="bothSides"/>
+            <wp:docPr id="12" name="Picture 12"/>
+            <wp:cNvGraphicFramePr/>
+            <a:graphic xmlns:pic="http://schemas.openxmlformats.org/drawingml/2006/picture">
+              <a:graphicData uri="http://schemas.openxmlformats.org/drawingml/2006/picture">
+                <pic:pic>
+                  <pic:nvPicPr>
+                    <pic:cNvPr id="0" name="image.jpg"/>
+                    <pic:cNvPicPr/>
+                  </pic:nvPicPr>
+                  <pic:blipFill>
+                    <a:blip r:embed="rId21"/>
+                    <a:stretch>
+                      <a:fillRect/>
+                    </a:stretch>
+                  </pic:blipFill>
+                  <pic:spPr>
+                    <a:xfrm>
+                      <a:off x="0" y="0"/>
+                      <a:ext cx="2057400" cy="2057400"/>
+                    </a:xfrm>
+                    <a:prstGeom prst="rect"/>
+                  </pic:spPr>
+                </pic:pic>
+              </a:graphicData>
+            </a:graphic>
+          </wp:anchor>
+        </w:drawing>
+      </w:r>
+    </w:p>
+    <w:p>
+      <w:pPr>
+        <w:spacing w:after="80"/>
+      </w:pPr>
+      <w:r>
+        <w:rPr>
+          <w:rFonts w:ascii="Georgia" w:hAnsi="Georgia" w:cs="Georgia"/>
+          <w:b w:val="0"/>
+          <w:i w:val="0"/>
+          <w:color w:val="222222"/>
+          <w:sz w:val="21"/>
+        </w:rPr>
+        <w:t>Above a frozen pond, ghostly blue lights flicker and bob, beckoning travelers out onto the ice with whispers of false promises. The scene looks tranquil, almost inviting, but the mist around the lights is far, far too cold.</w:t>
+      </w:r>
+    </w:p>
+    <w:p>
+      <w:pPr>
+        <w:pBdr>
+          <w:left w:val="single" w:sz="18" w:space="12" w:color="5B2A86"/>
+        </w:pBdr>
+        <w:shd w:val="clear" w:color="auto" w:fill="F4F0FA"/>
+        <w:spacing w:before="30" w:after="70"/>
+        <w:ind w:left="340" w:right="340"/>
+      </w:pPr>
+      <w:r>
+        <w:rPr>
+          <w:rFonts w:ascii="Georgia" w:hAnsi="Georgia" w:cs="Georgia"/>
+          <w:b w:val="0"/>
+          <w:i w:val="0"/>
+          <w:color w:val="222222"/>
+          <w:sz w:val="19"/>
+        </w:rPr>
+        <w:t xml:space="preserve">▶ </w:t>
+      </w:r>
+      <w:r>
+        <w:rPr>
+          <w:rFonts w:ascii="Georgia" w:hAnsi="Georgia" w:cs="Georgia"/>
+          <w:b/>
+          <w:i w:val="0"/>
+          <w:color w:val="222222"/>
+          <w:sz w:val="19"/>
+        </w:rPr>
+        <w:t>Frozen Will-o'-Wisps (CR 2 each).</w:t>
+      </w:r>
+      <w:r>
+        <w:rPr>
+          <w:rFonts w:ascii="Georgia" w:hAnsi="Georgia" w:cs="Georgia"/>
+          <w:b w:val="0"/>
+          <w:i w:val="0"/>
+          <w:color w:val="222222"/>
+          <w:sz w:val="19"/>
+        </w:rPr>
+        <w:t xml:space="preserve"> Wisdom (Perception) DC 14 notices strange ripples beneath the ice; Intelligence (Arcana) DC 15 names the lights for what they are. The careless suffer a surprise round, slippery ice (Dexterity DC 13 each round or fall prone), and 1d4 cold damage per round of exposure. Icy Shock deals lightning and cold together, and the wisps blink invisible between attacks. They guard a Gift Box, and a whispered warning of the Krampusshade's icy influence.</w:t>
+      </w:r>
+    </w:p>
+    <w:p>
+      <w:pPr>
+        <w:keepNext/>
+        <w:spacing w:before="220" w:after="60"/>
+      </w:pPr>
+      <w:r>
+        <w:rPr>
+          <w:rFonts w:ascii="Georgia" w:hAnsi="Georgia" w:cs="Georgia"/>
+          <w:b/>
+          <w:color w:val="A0522D"/>
+          <w:sz w:val="26"/>
+        </w:rPr>
+        <w:t>Kindly Wonders</w:t>
+      </w:r>
+    </w:p>
+    <w:p>
+      <w:pPr>
+        <w:spacing w:after="80"/>
+      </w:pPr>
+      <w:r>
+        <w:rPr>
+          <w:rFonts w:ascii="Georgia" w:hAnsi="Georgia" w:cs="Georgia"/>
+          <w:b w:val="0"/>
+          <w:i w:val="0"/>
+          <w:color w:val="222222"/>
+          <w:sz w:val="21"/>
+        </w:rPr>
+        <w:t>Not everything on the winter roads wished travelers ill. Some of it was watching, quietly, to see if they would be kind.</w:t>
+      </w:r>
+    </w:p>
+    <w:p>
+      <w:pPr>
+        <w:pBdr>
+          <w:left w:val="single" w:sz="18" w:space="12" w:color="5B2A86"/>
+        </w:pBdr>
+        <w:shd w:val="clear" w:color="auto" w:fill="F4F0FA"/>
+        <w:spacing w:before="30" w:after="70"/>
+        <w:ind w:left="340" w:right="340"/>
+      </w:pPr>
+      <w:r>
+        <w:rPr>
+          <w:rFonts w:ascii="Georgia" w:hAnsi="Georgia" w:cs="Georgia"/>
+          <w:b w:val="0"/>
+          <w:i w:val="0"/>
+          <w:color w:val="222222"/>
+          <w:sz w:val="19"/>
+        </w:rPr>
+        <w:t xml:space="preserve">▶ </w:t>
+      </w:r>
+      <w:r>
+        <w:rPr>
+          <w:rFonts w:ascii="Georgia" w:hAnsi="Georgia" w:cs="Georgia"/>
+          <w:b/>
+          <w:i w:val="0"/>
+          <w:color w:val="222222"/>
+          <w:sz w:val="19"/>
+        </w:rPr>
+        <w:t>Friendly Caribou.</w:t>
+      </w:r>
+      <w:r>
+        <w:rPr>
+          <w:rFonts w:ascii="Georgia" w:hAnsi="Georgia" w:cs="Georgia"/>
+          <w:b w:val="0"/>
+          <w:i w:val="0"/>
+          <w:color w:val="222222"/>
+          <w:sz w:val="19"/>
+        </w:rPr>
+        <w:t xml:space="preserve"> An enchanted caribou with softly glowing antlers steps from the treeline into the moonlight. Offering food or kind words earns its aura of warmth: each party member regains 1d4 hit points, and Wisdom (Animal Handling) DC 13 earns one hero Inspiration. Hostility makes it dissolve sadly into mist.</w:t>
+      </w:r>
+    </w:p>
+    <w:p>
+      <w:pPr>
+        <w:pBdr>
+          <w:left w:val="single" w:sz="18" w:space="12" w:color="5B2A86"/>
+        </w:pBdr>
+        <w:shd w:val="clear" w:color="auto" w:fill="F4F0FA"/>
+        <w:spacing w:before="30" w:after="70"/>
+        <w:ind w:left="340" w:right="340"/>
+      </w:pPr>
+      <w:r>
+        <w:rPr>
+          <w:rFonts w:ascii="Georgia" w:hAnsi="Georgia" w:cs="Georgia"/>
+          <w:b w:val="0"/>
+          <w:i w:val="0"/>
+          <w:color w:val="222222"/>
+          <w:sz w:val="19"/>
+        </w:rPr>
+        <w:t xml:space="preserve">▶ </w:t>
+      </w:r>
+      <w:r>
+        <w:rPr>
+          <w:rFonts w:ascii="Georgia" w:hAnsi="Georgia" w:cs="Georgia"/>
+          <w:b/>
+          <w:i w:val="0"/>
+          <w:color w:val="222222"/>
+          <w:sz w:val="19"/>
+        </w:rPr>
+        <w:t>Resting Reindeer.</w:t>
+      </w:r>
+      <w:r>
+        <w:rPr>
+          <w:rFonts w:ascii="Georgia" w:hAnsi="Georgia" w:cs="Georgia"/>
+          <w:b w:val="0"/>
+          <w:i w:val="0"/>
+          <w:color w:val="222222"/>
+          <w:sz w:val="19"/>
+        </w:rPr>
+        <w:t xml:space="preserve"> A majestic reindeer with antlers like polished silver rests beneath a frosted pine. Wisdom (Animal Handling) DC 14 to approach calmly; treated kindly, its nose glows softly and each hero gains Inspiration and temporary hit points equal to 1d6 + their level.</w:t>
+      </w:r>
+    </w:p>
+    <w:p>
+      <w:pPr>
+        <w:pBdr>
+          <w:left w:val="single" w:sz="18" w:space="12" w:color="5B2A86"/>
+        </w:pBdr>
+        <w:shd w:val="clear" w:color="auto" w:fill="F4F0FA"/>
+        <w:spacing w:before="30" w:after="70"/>
+        <w:ind w:left="340" w:right="340"/>
+      </w:pPr>
+      <w:r>
+        <w:rPr>
+          <w:rFonts w:ascii="Georgia" w:hAnsi="Georgia" w:cs="Georgia"/>
+          <w:b w:val="0"/>
+          <w:i w:val="0"/>
+          <w:color w:val="222222"/>
+          <w:sz w:val="19"/>
+        </w:rPr>
+        <w:t xml:space="preserve">▶ </w:t>
+      </w:r>
+      <w:r>
+        <w:rPr>
+          <w:rFonts w:ascii="Georgia" w:hAnsi="Georgia" w:cs="Georgia"/>
+          <w:b/>
+          <w:i w:val="0"/>
+          <w:color w:val="222222"/>
+          <w:sz w:val="19"/>
+        </w:rPr>
+        <w:t>Aurora Spirits.</w:t>
+      </w:r>
+      <w:r>
+        <w:rPr>
+          <w:rFonts w:ascii="Georgia" w:hAnsi="Georgia" w:cs="Georgia"/>
+          <w:b w:val="0"/>
+          <w:i w:val="0"/>
+          <w:color w:val="222222"/>
+          <w:sz w:val="19"/>
+        </w:rPr>
+        <w:t xml:space="preserve"> Beneath dancing ribbons of blue, purple, and green, serene spirits descend, humming an ethereal tune. Wisdom (Insight) DC 14 or Intelligence (Religion) DC 15 understands them as messengers of Elaria; they impart a cryptic hint about the Krampusshade and grant advantage on the next Wisdom saving throw.</w:t>
+      </w:r>
+    </w:p>
+    <w:p>
+      <w:pPr>
+        <w:pBdr>
+          <w:left w:val="single" w:sz="18" w:space="12" w:color="5B2A86"/>
+        </w:pBdr>
+        <w:shd w:val="clear" w:color="auto" w:fill="F4F0FA"/>
+        <w:spacing w:before="30" w:after="70"/>
+        <w:ind w:left="340" w:right="340"/>
+      </w:pPr>
+      <w:r>
+        <w:rPr>
+          <w:rFonts w:ascii="Georgia" w:hAnsi="Georgia" w:cs="Georgia"/>
+          <w:b w:val="0"/>
+          <w:i w:val="0"/>
+          <w:color w:val="222222"/>
+          <w:sz w:val="19"/>
+        </w:rPr>
+        <w:t xml:space="preserve">▶ </w:t>
+      </w:r>
+      <w:r>
+        <w:rPr>
+          <w:rFonts w:ascii="Georgia" w:hAnsi="Georgia" w:cs="Georgia"/>
+          <w:b/>
+          <w:i w:val="0"/>
+          <w:color w:val="222222"/>
+          <w:sz w:val="19"/>
+        </w:rPr>
+        <w:t>Fey Tricksters.</w:t>
+      </w:r>
+      <w:r>
+        <w:rPr>
+          <w:rFonts w:ascii="Georgia" w:hAnsi="Georgia" w:cs="Georgia"/>
+          <w:b w:val="0"/>
+          <w:i w:val="0"/>
+          <w:color w:val="222222"/>
+          <w:sz w:val="19"/>
+        </w:rPr>
+        <w:t xml:space="preserve"> Small winged pranksters flit between the trees and propose a riddle contest (Intelligence DC 15) or spring a prank to dodge (Dexterity DC 14). Winners receive a charm of luck, advantage on one roll of their choice; losers get a pie in the face and disadvantage on their next skill check.</w:t>
+      </w:r>
+    </w:p>
+    <w:p>
+      <w:pPr>
+        <w:pBdr>
+          <w:left w:val="single" w:sz="18" w:space="12" w:color="5B2A86"/>
+        </w:pBdr>
+        <w:shd w:val="clear" w:color="auto" w:fill="F4F0FA"/>
+        <w:spacing w:before="30" w:after="70"/>
+        <w:ind w:left="340" w:right="340"/>
+      </w:pPr>
+      <w:r>
+        <w:rPr>
+          <w:rFonts w:ascii="Georgia" w:hAnsi="Georgia" w:cs="Georgia"/>
+          <w:b w:val="0"/>
+          <w:i w:val="0"/>
+          <w:color w:val="222222"/>
+          <w:sz w:val="19"/>
+        </w:rPr>
+        <w:t xml:space="preserve">▶ </w:t>
+      </w:r>
+      <w:r>
+        <w:rPr>
+          <w:rFonts w:ascii="Georgia" w:hAnsi="Georgia" w:cs="Georgia"/>
+          <w:b/>
+          <w:i w:val="0"/>
+          <w:color w:val="222222"/>
+          <w:sz w:val="19"/>
+        </w:rPr>
+        <w:t>Holiday Miracle.</w:t>
+      </w:r>
+      <w:r>
+        <w:rPr>
+          <w:rFonts w:ascii="Georgia" w:hAnsi="Georgia" w:cs="Georgia"/>
+          <w:b w:val="0"/>
+          <w:i w:val="0"/>
+          <w:color w:val="222222"/>
+          <w:sz w:val="19"/>
+        </w:rPr>
+        <w:t xml:space="preserve"> A sudden warm breeze carries the scent of pine, cinnamon, and fresh cookies, restoring 1d4 hit points to each party member. For a moment, the world feels kinder, and the shadows retreat just a little.</w:t>
+      </w:r>
+    </w:p>
+    <w:p>
+      <w:pPr>
+        <w:keepNext/>
+        <w:spacing w:before="220" w:after="60"/>
+      </w:pPr>
+      <w:r>
+        <w:rPr>
+          <w:rFonts w:ascii="Georgia" w:hAnsi="Georgia" w:cs="Georgia"/>
+          <w:b/>
+          <w:color w:val="A0522D"/>
+          <w:sz w:val="26"/>
+        </w:rPr>
+        <w:t>Treasures in the Ice</w:t>
+      </w:r>
+    </w:p>
+    <w:p>
+      <w:pPr>
+        <w:pBdr>
+          <w:left w:val="single" w:sz="18" w:space="12" w:color="5B2A86"/>
+        </w:pBdr>
+        <w:shd w:val="clear" w:color="auto" w:fill="F4F0FA"/>
+        <w:spacing w:before="30" w:after="70"/>
+        <w:ind w:left="340" w:right="340"/>
+      </w:pPr>
+      <w:r>
+        <w:rPr>
+          <w:rFonts w:ascii="Georgia" w:hAnsi="Georgia" w:cs="Georgia"/>
+          <w:b w:val="0"/>
+          <w:i w:val="0"/>
+          <w:color w:val="222222"/>
+          <w:sz w:val="19"/>
+        </w:rPr>
+        <w:t xml:space="preserve">▶ </w:t>
+      </w:r>
+      <w:r>
+        <w:rPr>
+          <w:rFonts w:ascii="Georgia" w:hAnsi="Georgia" w:cs="Georgia"/>
+          <w:b/>
+          <w:i w:val="0"/>
+          <w:color w:val="222222"/>
+          <w:sz w:val="19"/>
+        </w:rPr>
+        <w:t>The Sleeping Traveler.</w:t>
+      </w:r>
+      <w:r>
+        <w:rPr>
+          <w:rFonts w:ascii="Georgia" w:hAnsi="Georgia" w:cs="Georgia"/>
+          <w:b w:val="0"/>
+          <w:i w:val="0"/>
+          <w:color w:val="222222"/>
+          <w:sz w:val="19"/>
+        </w:rPr>
+        <w:t xml:space="preserve"> A traveler frozen beneath a drift, still and peaceful as a statue, one outstretched hand holding a crumpled note. Intelligence (Investigation) DC 12 preserves the brittle parchment: a warning about the Krampusshade's minions and, tucked beneath the traveler's coat, a </w:t>
+      </w:r>
+      <w:r>
+        <w:rPr>
+          <w:rFonts w:ascii="Georgia" w:hAnsi="Georgia" w:cs="Georgia"/>
+          <w:b/>
+          <w:i w:val="0"/>
+          <w:color w:val="222222"/>
+          <w:sz w:val="19"/>
+        </w:rPr>
+        <w:t>Map of Hidden Paths</w:t>
+      </w:r>
+      <w:r>
+        <w:rPr>
+          <w:rFonts w:ascii="Georgia" w:hAnsi="Georgia" w:cs="Georgia"/>
+          <w:b w:val="0"/>
+          <w:i w:val="0"/>
+          <w:color w:val="222222"/>
+          <w:sz w:val="19"/>
+        </w:rPr>
+        <w:t xml:space="preserve"> granting advantage on the next Survival check to navigate the snowy wilderness.</w:t>
+      </w:r>
+    </w:p>
+    <w:p>
+      <w:pPr>
+        <w:pBdr>
+          <w:left w:val="single" w:sz="18" w:space="12" w:color="5B2A86"/>
+        </w:pBdr>
+        <w:shd w:val="clear" w:color="auto" w:fill="F4F0FA"/>
+        <w:spacing w:before="30" w:after="70"/>
+        <w:ind w:left="340" w:right="340"/>
+      </w:pPr>
+      <w:r>
+        <w:rPr>
+          <w:rFonts w:ascii="Georgia" w:hAnsi="Georgia" w:cs="Georgia"/>
+          <w:b w:val="0"/>
+          <w:i w:val="0"/>
+          <w:color w:val="222222"/>
+          <w:sz w:val="19"/>
+        </w:rPr>
+        <w:t xml:space="preserve">▶ </w:t>
+      </w:r>
+      <w:r>
+        <w:rPr>
+          <w:rFonts w:ascii="Georgia" w:hAnsi="Georgia" w:cs="Georgia"/>
+          <w:b/>
+          <w:i w:val="0"/>
+          <w:color w:val="222222"/>
+          <w:sz w:val="19"/>
+        </w:rPr>
+        <w:t>Frozen Treasure.</w:t>
+      </w:r>
+      <w:r>
+        <w:rPr>
+          <w:rFonts w:ascii="Georgia" w:hAnsi="Georgia" w:cs="Georgia"/>
+          <w:b w:val="0"/>
+          <w:i w:val="0"/>
+          <w:color w:val="222222"/>
+          <w:sz w:val="19"/>
+        </w:rPr>
+        <w:t xml:space="preserve"> A sturdy chest sealed inside a block of ice carved with faintly glowing runes. Strength DC 15 breaks it open, Intelligence (Arcana) DC 14 finds the weak point, and fire magic melts it in a single round; a failed attempt stings for 2d6 cold damage. Inside wait 50 gold pieces and a Frosted Cookie of Restoration.</w:t>
+      </w:r>
+    </w:p>
+    <w:p>
+      <w:pPr>
+        <w:pBdr>
+          <w:left w:val="single" w:sz="18" w:space="12" w:color="5B2A86"/>
+        </w:pBdr>
+        <w:shd w:val="clear" w:color="auto" w:fill="F4F0FA"/>
+        <w:spacing w:before="30" w:after="70"/>
+        <w:ind w:left="340" w:right="340"/>
+      </w:pPr>
+      <w:r>
+        <w:rPr>
+          <w:rFonts w:ascii="Georgia" w:hAnsi="Georgia" w:cs="Georgia"/>
+          <w:b w:val="0"/>
+          <w:i w:val="0"/>
+          <w:color w:val="222222"/>
+          <w:sz w:val="19"/>
+        </w:rPr>
+        <w:t>▶ Full statistics for every creature of the frozen roads live in the bestiary compendium. The creatures the heroes actually crossed blades with appear in the Appendix at the back of this session.</w:t>
+      </w:r>
+    </w:p>
+    <w:p>
+      <w:pPr>
+        <w:keepNext/>
+        <w:spacing w:before="400" w:after="120"/>
+        <w:pBdr>
+          <w:bottom w:val="single" w:sz="6" w:space="4" w:color="B8860B"/>
+        </w:pBdr>
+      </w:pPr>
+      <w:r>
+        <w:rPr>
+          <w:rFonts w:ascii="Georgia" w:hAnsi="Georgia" w:cs="Georgia"/>
+          <w:b/>
+          <w:color w:val="B8860B"/>
+          <w:sz w:val="32"/>
+        </w:rPr>
+        <w:t>Part Three: The Lorekeeper's Tale</w:t>
+      </w:r>
+    </w:p>
+    <w:p>
+      <w:pPr>
+        <w:spacing w:before="120" w:after="200"/>
+      </w:pPr>
+      <w:r>
+        <w:rPr>
+          <w:rFonts w:ascii="Georgia" w:hAnsi="Georgia" w:cs="Georgia"/>
+          <w:b w:val="0"/>
+          <w:i/>
+          <w:color w:val="222222"/>
+          <w:sz w:val="21"/>
+        </w:rPr>
+        <w:t>With eight bells wrapped warm in their packs, the heroes crossed town as the light failed, to a small cottage swallowed in ivy at the edge of Havenmoor.</w:t>
       </w:r>
     </w:p>
     <w:p>
@@ -2028,7 +4173,7 @@
           <w:color w:val="222222"/>
           <w:sz w:val="21"/>
         </w:rPr>
-        <w:t xml:space="preserve">Inside, the cottage smells of herbs, pine, and old parchment. Shelves of ancient tomes and glowing crystals hum with stories. Faelan sets a wooden tray before the party: three </w:t>
+        <w:t xml:space="preserve">The door creaks open before anyone can knock. </w:t>
       </w:r>
       <w:r>
         <w:rPr>
@@ -2038,7 +4183,7 @@
           <w:color w:val="222222"/>
           <w:sz w:val="21"/>
         </w:rPr>
-        <w:t>frosted cookies</w:t>
+        <w:t>Faelan</w:t>
       </w:r>
       <w:r>
         <w:rPr>
@@ -2048,355 +4193,7 @@
           <w:color w:val="222222"/>
           <w:sz w:val="21"/>
         </w:rPr>
-        <w:t>, each shimmering faintly with magic. “Take these. They will warm your bodies and spirits in the trials ahead.”</w:t>
-      </w:r>
-    </w:p>
-    <w:p>
-      <w:pPr>
-        <w:pBdr>
-          <w:left w:val="single" w:sz="18" w:space="12" w:color="5B2A86"/>
-        </w:pBdr>
-        <w:shd w:val="clear" w:color="auto" w:fill="F4F0FA"/>
-        <w:spacing w:before="30" w:after="70"/>
-        <w:ind w:left="340" w:right="340"/>
-      </w:pPr>
-      <w:r>
-        <w:rPr>
-          <w:rFonts w:ascii="Georgia" w:hAnsi="Georgia" w:cs="Georgia"/>
-          <w:b w:val="0"/>
-          <w:i w:val="0"/>
-          <w:color w:val="222222"/>
-          <w:sz w:val="19"/>
-        </w:rPr>
-        <w:t xml:space="preserve">▶ </w:t>
-      </w:r>
-      <w:r>
-        <w:rPr>
-          <w:rFonts w:ascii="Georgia" w:hAnsi="Georgia" w:cs="Georgia"/>
-          <w:b/>
-          <w:i w:val="0"/>
-          <w:color w:val="222222"/>
-          <w:sz w:val="19"/>
-        </w:rPr>
-        <w:t>Faelan's Frosted Cookies.</w:t>
-      </w:r>
-      <w:r>
-        <w:rPr>
-          <w:rFonts w:ascii="Georgia" w:hAnsi="Georgia" w:cs="Georgia"/>
-          <w:b w:val="0"/>
-          <w:i w:val="0"/>
-          <w:color w:val="222222"/>
-          <w:sz w:val="19"/>
-        </w:rPr>
-        <w:t xml:space="preserve"> Each restores 2d8 HP, grants the benefit of a short rest, and restores one expended spell slot. Cookie-based healing: the finest kind.</w:t>
-      </w:r>
-    </w:p>
-    <w:p>
-      <w:pPr>
-        <w:pBdr>
-          <w:left w:val="single" w:sz="18" w:space="12" w:color="B8860B"/>
-        </w:pBdr>
-        <w:shd w:val="clear" w:color="auto" w:fill="FBF6EA"/>
-        <w:spacing w:before="30" w:after="70"/>
-        <w:ind w:left="340" w:right="340"/>
-      </w:pPr>
-      <w:r>
-        <w:rPr>
-          <w:rFonts w:ascii="Georgia" w:hAnsi="Georgia" w:cs="Georgia"/>
-          <w:b w:val="0"/>
-          <w:i w:val="0"/>
-          <w:color w:val="222222"/>
-          <w:sz w:val="21"/>
-        </w:rPr>
-        <w:t xml:space="preserve">Then the old lorekeeper settles into his chair, and his eyes darken. “Long ago, when winter nights seemed endless, the people of Havenmoor called on the light of the </w:t>
-      </w:r>
-      <w:r>
-        <w:rPr>
-          <w:rFonts w:ascii="Georgia" w:hAnsi="Georgia" w:cs="Georgia"/>
-          <w:b/>
-          <w:i w:val="0"/>
-          <w:color w:val="222222"/>
-          <w:sz w:val="21"/>
-        </w:rPr>
-        <w:t>Winter Bells</w:t>
-      </w:r>
-      <w:r>
-        <w:rPr>
-          <w:rFonts w:ascii="Georgia" w:hAnsi="Georgia" w:cs="Georgia"/>
-          <w:b w:val="0"/>
-          <w:i w:val="0"/>
-          <w:color w:val="222222"/>
-          <w:sz w:val="21"/>
-        </w:rPr>
-        <w:t xml:space="preserve">. The bells hold the blessing of </w:t>
-      </w:r>
-      <w:r>
-        <w:rPr>
-          <w:rFonts w:ascii="Georgia" w:hAnsi="Georgia" w:cs="Georgia"/>
-          <w:b/>
-          <w:i w:val="0"/>
-          <w:color w:val="222222"/>
-          <w:sz w:val="21"/>
-        </w:rPr>
-        <w:t>Elaria</w:t>
-      </w:r>
-      <w:r>
-        <w:rPr>
-          <w:rFonts w:ascii="Georgia" w:hAnsi="Georgia" w:cs="Georgia"/>
-          <w:b w:val="0"/>
-          <w:i w:val="0"/>
-          <w:color w:val="222222"/>
-          <w:sz w:val="21"/>
-        </w:rPr>
-        <w:t xml:space="preserve">, goddess of hope and protection. Rung in harmony, they drive back the shadows.” His fingers trace a symbol on his staff. “But there was one who thrived in the cold and dark. The </w:t>
-      </w:r>
-      <w:r>
-        <w:rPr>
-          <w:rFonts w:ascii="Georgia" w:hAnsi="Georgia" w:cs="Georgia"/>
-          <w:b/>
-          <w:i w:val="0"/>
-          <w:color w:val="222222"/>
-          <w:sz w:val="21"/>
-        </w:rPr>
-        <w:t>Krampusshade</w:t>
-      </w:r>
-      <w:r>
-        <w:rPr>
-          <w:rFonts w:ascii="Georgia" w:hAnsi="Georgia" w:cs="Georgia"/>
-          <w:b w:val="0"/>
-          <w:i w:val="0"/>
-          <w:color w:val="222222"/>
-          <w:sz w:val="21"/>
-        </w:rPr>
-        <w:t>. Once a guardian of winter, twisted by bitterness and envy, he turned against the light. He feasts on fear. He steals the joy of children and traps their laughter in a sack of shadows. The bells are the key to weakening him, for they carry the last remnants of Elaria's light here.”</w:t>
-      </w:r>
-    </w:p>
-    <w:p>
-      <w:pPr>
-        <w:pBdr>
-          <w:left w:val="single" w:sz="18" w:space="12" w:color="B8860B"/>
-        </w:pBdr>
-        <w:shd w:val="clear" w:color="auto" w:fill="FBF6EA"/>
-        <w:spacing w:before="30" w:after="70"/>
-        <w:ind w:left="340" w:right="340"/>
-      </w:pPr>
-      <w:r>
-        <w:rPr>
-          <w:rFonts w:ascii="Georgia" w:hAnsi="Georgia" w:cs="Georgia"/>
-          <w:b w:val="0"/>
-          <w:i w:val="0"/>
-          <w:color w:val="222222"/>
-          <w:sz w:val="21"/>
-        </w:rPr>
-        <w:t xml:space="preserve">He spreads a weathered map and taps three places in the wilderness around Havenmoor, one, two, three. “His power is anchored by three </w:t>
-      </w:r>
-      <w:r>
-        <w:rPr>
-          <w:rFonts w:ascii="Georgia" w:hAnsi="Georgia" w:cs="Georgia"/>
-          <w:b/>
-          <w:i w:val="0"/>
-          <w:color w:val="222222"/>
-          <w:sz w:val="21"/>
-        </w:rPr>
-        <w:t>barriers of darkness</w:t>
-      </w:r>
-      <w:r>
-        <w:rPr>
-          <w:rFonts w:ascii="Georgia" w:hAnsi="Georgia" w:cs="Georgia"/>
-          <w:b w:val="0"/>
-          <w:i w:val="0"/>
-          <w:color w:val="222222"/>
-          <w:sz w:val="21"/>
-        </w:rPr>
-        <w:t xml:space="preserve">. The </w:t>
-      </w:r>
-      <w:r>
-        <w:rPr>
-          <w:rFonts w:ascii="Georgia" w:hAnsi="Georgia" w:cs="Georgia"/>
-          <w:b/>
-          <w:i w:val="0"/>
-          <w:color w:val="222222"/>
-          <w:sz w:val="21"/>
-        </w:rPr>
-        <w:t>Frostpine Glade</w:t>
-      </w:r>
-      <w:r>
-        <w:rPr>
-          <w:rFonts w:ascii="Georgia" w:hAnsi="Georgia" w:cs="Georgia"/>
-          <w:b w:val="0"/>
-          <w:i w:val="0"/>
-          <w:color w:val="222222"/>
-          <w:sz w:val="21"/>
-        </w:rPr>
-        <w:t xml:space="preserve">, where ancient pines have twisted under frost and shadow. The </w:t>
-      </w:r>
-      <w:r>
-        <w:rPr>
-          <w:rFonts w:ascii="Georgia" w:hAnsi="Georgia" w:cs="Georgia"/>
-          <w:b/>
-          <w:i w:val="0"/>
-          <w:color w:val="222222"/>
-          <w:sz w:val="21"/>
-        </w:rPr>
-        <w:t>Crystalbrook Stream</w:t>
-      </w:r>
-      <w:r>
-        <w:rPr>
-          <w:rFonts w:ascii="Georgia" w:hAnsi="Georgia" w:cs="Georgia"/>
-          <w:b w:val="0"/>
-          <w:i w:val="0"/>
-          <w:color w:val="222222"/>
-          <w:sz w:val="21"/>
-        </w:rPr>
-        <w:t xml:space="preserve">, where dark tendrils lurk beneath the ice. The </w:t>
-      </w:r>
-      <w:r>
-        <w:rPr>
-          <w:rFonts w:ascii="Georgia" w:hAnsi="Georgia" w:cs="Georgia"/>
-          <w:b/>
-          <w:i w:val="0"/>
-          <w:color w:val="222222"/>
-          <w:sz w:val="21"/>
-        </w:rPr>
-        <w:t>Whispering Hollow</w:t>
-      </w:r>
-      <w:r>
-        <w:rPr>
-          <w:rFonts w:ascii="Georgia" w:hAnsi="Georgia" w:cs="Georgia"/>
-          <w:b w:val="0"/>
-          <w:i w:val="0"/>
-          <w:color w:val="222222"/>
-          <w:sz w:val="21"/>
-        </w:rPr>
-        <w:t>, where the very stones whisper despair. Travel to each. Ring the bells. Shatter the barriers. Only then can the Krampusshade be banished for good. His minions will not let you pass easily. But I have faith in you. You carry the light of hope, even in the deepest winter.”</w:t>
-      </w:r>
-    </w:p>
-    <w:p>
-      <w:pPr>
-        <w:pBdr>
-          <w:left w:val="single" w:sz="18" w:space="12" w:color="B8860B"/>
-        </w:pBdr>
-        <w:shd w:val="clear" w:color="auto" w:fill="FBF6EA"/>
-        <w:spacing w:before="30" w:after="70"/>
-        <w:ind w:left="340" w:right="340"/>
-      </w:pPr>
-      <w:r>
-        <w:rPr>
-          <w:rFonts w:ascii="Georgia" w:hAnsi="Georgia" w:cs="Georgia"/>
-          <w:b w:val="0"/>
-          <w:i w:val="0"/>
-          <w:color w:val="222222"/>
-          <w:sz w:val="21"/>
-        </w:rPr>
-        <w:t>Faelan raises his hands, and a soft silver light washes over each of you, warmth seeping into your bones. “Go now, brave souls. May the bells guide you, and may Elaria's light shield you from the shadows.”</w:t>
-      </w:r>
-    </w:p>
-    <w:p>
-      <w:pPr>
-        <w:keepNext/>
-        <w:spacing w:before="400" w:after="120"/>
-        <w:pBdr>
-          <w:bottom w:val="single" w:sz="6" w:space="4" w:color="B8860B"/>
-        </w:pBdr>
-      </w:pPr>
-      <w:r>
-        <w:rPr>
-          <w:rFonts w:ascii="Georgia" w:hAnsi="Georgia" w:cs="Georgia"/>
-          <w:b/>
-          <w:color w:val="B8860B"/>
-          <w:sz w:val="32"/>
-        </w:rPr>
-        <w:t>Part Four: The Three Barriers of Darkness</w:t>
-      </w:r>
-    </w:p>
-    <w:p>
-      <w:pPr>
-        <w:spacing w:before="120" w:after="200"/>
-      </w:pPr>
-      <w:r>
-        <w:rPr>
-          <w:rFonts w:ascii="Georgia" w:hAnsi="Georgia" w:cs="Georgia"/>
-          <w:b w:val="0"/>
-          <w:i/>
-          <w:color w:val="222222"/>
-          <w:sz w:val="21"/>
-        </w:rPr>
-        <w:t>Three marks on a map, eight bells, and one long winter day: the heroes went out into the white silence to take the Krampusshade's power apart, one song at a time.</w:t>
-      </w:r>
-    </w:p>
-    <w:p>
-      <w:pPr>
-        <w:keepNext/>
-        <w:spacing w:before="220" w:after="60"/>
-      </w:pPr>
-      <w:r>
-        <w:rPr>
-          <w:rFonts w:ascii="Georgia" w:hAnsi="Georgia" w:cs="Georgia"/>
-          <w:b/>
-          <w:color w:val="A0522D"/>
-          <w:sz w:val="26"/>
-        </w:rPr>
-        <w:t>The Frostpine Glade: Jingle Bells</w:t>
-      </w:r>
-    </w:p>
-    <w:p>
-      <w:pPr>
-        <w:pBdr>
-          <w:left w:val="single" w:sz="18" w:space="12" w:color="B8860B"/>
-        </w:pBdr>
-        <w:shd w:val="clear" w:color="auto" w:fill="FBF6EA"/>
-        <w:spacing w:before="30" w:after="70"/>
-        <w:ind w:left="340" w:right="340"/>
-      </w:pPr>
-      <w:r>
-        <w:rPr>
-          <w:rFonts w:ascii="Georgia" w:hAnsi="Georgia" w:cs="Georgia"/>
-          <w:b w:val="0"/>
-          <w:i w:val="0"/>
-          <w:color w:val="222222"/>
-          <w:sz w:val="21"/>
-        </w:rPr>
-        <w:t>The pines around the glade creak under armor of ice, and the mist between them curls as though alive. At the center stands a massive frozen pine, its trunk twisted and blackened, jagged chains of black ice wrapped around its roots. On the wind ride faint, mournful whispers: the far-off cries of taken children. The black ice pulses with a sickly blue light, humming a low, wrong-noted mockery of a holiday tune.</w:t>
-      </w:r>
-    </w:p>
-    <w:p>
-      <w:pPr>
-        <w:pBdr>
-          <w:left w:val="single" w:sz="18" w:space="12" w:color="B8860B"/>
-        </w:pBdr>
-        <w:shd w:val="clear" w:color="auto" w:fill="FBF6EA"/>
-        <w:spacing w:before="30" w:after="70"/>
-        <w:ind w:left="340" w:right="340"/>
-      </w:pPr>
-      <w:r>
-        <w:rPr>
-          <w:rFonts w:ascii="Georgia" w:hAnsi="Georgia" w:cs="Georgia"/>
-          <w:b w:val="0"/>
-          <w:i w:val="0"/>
-          <w:color w:val="222222"/>
-          <w:sz w:val="21"/>
-        </w:rPr>
-        <w:t xml:space="preserve">The answer is the true song. The heroes line up their bells and play it the way it was always meant to sound: </w:t>
-      </w:r>
-      <w:r>
-        <w:rPr>
-          <w:rFonts w:ascii="Georgia" w:hAnsi="Georgia" w:cs="Georgia"/>
-          <w:b/>
-          <w:i w:val="0"/>
-          <w:color w:val="222222"/>
-          <w:sz w:val="21"/>
-        </w:rPr>
-        <w:t>Jingle Bells</w:t>
-      </w:r>
-      <w:r>
-        <w:rPr>
-          <w:rFonts w:ascii="Georgia" w:hAnsi="Georgia" w:cs="Georgia"/>
-          <w:b w:val="0"/>
-          <w:i w:val="0"/>
-          <w:color w:val="222222"/>
-          <w:sz w:val="21"/>
-        </w:rPr>
-        <w:t>, bright and defiant in the dead air. On the last note, golden light bursts from the bells and rolls through the black ice, and the chains shatter with a crack that shakes snow from every branch.</w:t>
+        <w:t>, the village lorekeeper, is an elderly half-elf with long silver hair and piercing violet eyes, wrapped in a deep green cloak stitched with symbols of winter and renewal. “Welcome, brave ones. You have done well to gather the bells: relics of light and hope. Please, come in. We have much to discuss.”</w:t>
       </w:r>
     </w:p>
     <w:p>
@@ -2409,7 +4206,7 @@
         <w:drawing>
           <wp:inline xmlns:a="http://schemas.openxmlformats.org/drawingml/2006/main" xmlns:pic="http://schemas.openxmlformats.org/drawingml/2006/picture">
             <wp:extent cx="3566160" cy="3566160"/>
-            <wp:docPr id="6" name="Picture 6"/>
+            <wp:docPr id="13" name="Picture 13"/>
             <wp:cNvGraphicFramePr>
               <a:graphicFrameLocks noChangeAspect="1"/>
             </wp:cNvGraphicFramePr>
@@ -2421,7 +4218,7 @@
                     <pic:cNvPicPr/>
                   </pic:nvPicPr>
                   <pic:blipFill>
-                    <a:blip r:embed="rId15"/>
+                    <a:blip r:embed="rId22"/>
                     <a:stretch>
                       <a:fillRect/>
                     </a:stretch>
@@ -2452,7 +4249,7 @@
           <w:color w:val="888888"/>
           <w:sz w:val="18"/>
         </w:rPr>
-        <w:t>Bells raised, the heroes play the true song, and Elaria's light unmakes the barrier of darkness.</w:t>
+        <w:t>Faelan the lorekeeper, among his tomes and glowing crystals in the ivy cottage.</w:t>
       </w:r>
     </w:p>
     <w:p>
@@ -2472,7 +4269,7 @@
           <w:color w:val="222222"/>
           <w:sz w:val="21"/>
         </w:rPr>
-        <w:t xml:space="preserve">The mist answers back. It gathers itself into three snarling shapes: </w:t>
+        <w:t xml:space="preserve">Inside, the cottage smells of herbs, pine, and old parchment. Shelves of ancient tomes and glowing crystals hum with stories. Faelan sets a wooden tray before the party: three </w:t>
       </w:r>
       <w:r>
         <w:rPr>
@@ -2482,7 +4279,7 @@
           <w:color w:val="222222"/>
           <w:sz w:val="21"/>
         </w:rPr>
-        <w:t>Frozen Wolves</w:t>
+        <w:t>frosted cookies</w:t>
       </w:r>
       <w:r>
         <w:rPr>
@@ -2492,7 +4289,7 @@
           <w:color w:val="222222"/>
           <w:sz w:val="21"/>
         </w:rPr>
-        <w:t>, frost-armored, eyes burning icy blue, guardians grown from the Krampusshade's own cold. The fight is knives and starlight on slick ground, wolf breath rolling white and freezing, until the last wolf comes apart into glittering mist, and the glade breathes again.</w:t>
+        <w:t>, each shimmering faintly with magic. “Take these. They will warm your bodies and spirits in the trials ahead.”</w:t>
       </w:r>
     </w:p>
     <w:p>
@@ -2512,7 +4309,7 @@
           <w:color w:val="222222"/>
           <w:sz w:val="19"/>
         </w:rPr>
-        <w:t xml:space="preserve">▶ The carol lock: E E E, E E E, E G C D E, F F F F, F E E E. Then </w:t>
+        <w:t xml:space="preserve">▶ </w:t>
       </w:r>
       <w:r>
         <w:rPr>
@@ -2522,7 +4319,7 @@
           <w:color w:val="222222"/>
           <w:sz w:val="19"/>
         </w:rPr>
-        <w:t>3 Frozen Wolves</w:t>
+        <w:t>Faelan's Frosted Cookies.</w:t>
       </w:r>
       <w:r>
         <w:rPr>
@@ -2532,22 +4329,7 @@
           <w:color w:val="222222"/>
           <w:sz w:val="19"/>
         </w:rPr>
-        <w:t xml:space="preserve"> (pack tactics, icy ground). First barrier down.</w:t>
-      </w:r>
-    </w:p>
-    <w:p>
-      <w:pPr>
-        <w:keepNext/>
-        <w:spacing w:before="220" w:after="60"/>
-      </w:pPr>
-      <w:r>
-        <w:rPr>
-          <w:rFonts w:ascii="Georgia" w:hAnsi="Georgia" w:cs="Georgia"/>
-          <w:b/>
-          <w:color w:val="A0522D"/>
-          <w:sz w:val="26"/>
-        </w:rPr>
-        <w:t>The Crystalbrook Stream: Deck the Halls</w:t>
+        <w:t xml:space="preserve"> Each restores 2d8 HP, grants the benefit of a short rest, and restores one expended spell slot. Cookie-based healing: the finest kind.</w:t>
       </w:r>
     </w:p>
     <w:p>
@@ -2567,7 +4349,67 @@
           <w:color w:val="222222"/>
           <w:sz w:val="21"/>
         </w:rPr>
-        <w:t>The stream winds through a grove of silver-barked trees, its water glittering under a skin of ice. A rickety wooden bridge crosses at the narrows, and beneath it, dark tendrils snake along the underside of the planks, pulsing. Shadowy shapes flicker under the ice, faces twisted in silent song. Frost blooms across the boards as the party steps up.</w:t>
+        <w:t xml:space="preserve">Then the old lorekeeper settles into his chair, and his eyes darken. “Long ago, when winter nights seemed endless, the people of Havenmoor called on the light of the </w:t>
+      </w:r>
+      <w:r>
+        <w:rPr>
+          <w:rFonts w:ascii="Georgia" w:hAnsi="Georgia" w:cs="Georgia"/>
+          <w:b/>
+          <w:i w:val="0"/>
+          <w:color w:val="222222"/>
+          <w:sz w:val="21"/>
+        </w:rPr>
+        <w:t>Winter Bells</w:t>
+      </w:r>
+      <w:r>
+        <w:rPr>
+          <w:rFonts w:ascii="Georgia" w:hAnsi="Georgia" w:cs="Georgia"/>
+          <w:b w:val="0"/>
+          <w:i w:val="0"/>
+          <w:color w:val="222222"/>
+          <w:sz w:val="21"/>
+        </w:rPr>
+        <w:t xml:space="preserve">. The bells hold the blessing of </w:t>
+      </w:r>
+      <w:r>
+        <w:rPr>
+          <w:rFonts w:ascii="Georgia" w:hAnsi="Georgia" w:cs="Georgia"/>
+          <w:b/>
+          <w:i w:val="0"/>
+          <w:color w:val="222222"/>
+          <w:sz w:val="21"/>
+        </w:rPr>
+        <w:t>Elaria</w:t>
+      </w:r>
+      <w:r>
+        <w:rPr>
+          <w:rFonts w:ascii="Georgia" w:hAnsi="Georgia" w:cs="Georgia"/>
+          <w:b w:val="0"/>
+          <w:i w:val="0"/>
+          <w:color w:val="222222"/>
+          <w:sz w:val="21"/>
+        </w:rPr>
+        <w:t xml:space="preserve">, goddess of hope and protection. Rung in harmony, they drive back the shadows.” His fingers trace a symbol on his staff. “But there was one who thrived in the cold and dark. The </w:t>
+      </w:r>
+      <w:r>
+        <w:rPr>
+          <w:rFonts w:ascii="Georgia" w:hAnsi="Georgia" w:cs="Georgia"/>
+          <w:b/>
+          <w:i w:val="0"/>
+          <w:color w:val="222222"/>
+          <w:sz w:val="21"/>
+        </w:rPr>
+        <w:t>Krampusshade</w:t>
+      </w:r>
+      <w:r>
+        <w:rPr>
+          <w:rFonts w:ascii="Georgia" w:hAnsi="Georgia" w:cs="Georgia"/>
+          <w:b w:val="0"/>
+          <w:i w:val="0"/>
+          <w:color w:val="222222"/>
+          <w:sz w:val="21"/>
+        </w:rPr>
+        <w:t>. Once a guardian of winter, twisted by bitterness and envy, he turned against the light. He feasts on fear. He steals the joy of children and traps their laughter in a sack of shadows. The bells are the key to weakening him, for they carry the last remnants of Elaria's light here.”</w:t>
       </w:r>
     </w:p>
     <w:p>
@@ -2587,7 +4429,7 @@
           <w:color w:val="222222"/>
           <w:sz w:val="21"/>
         </w:rPr>
-        <w:t xml:space="preserve">Eight bells ring out </w:t>
+        <w:t xml:space="preserve">He spreads a weathered map and taps three places in the wilderness around Havenmoor, one, two, three. “His power is anchored by three </w:t>
       </w:r>
       <w:r>
         <w:rPr>
@@ -2597,7 +4439,7 @@
           <w:color w:val="222222"/>
           <w:sz w:val="21"/>
         </w:rPr>
-        <w:t>Deck the Halls</w:t>
+        <w:t>barriers of darkness</w:t>
       </w:r>
       <w:r>
         <w:rPr>
@@ -2607,7 +4449,7 @@
           <w:color w:val="222222"/>
           <w:sz w:val="21"/>
         </w:rPr>
-        <w:t xml:space="preserve">, lively and warm, the notes echoing down the frozen water like skaters. The tendrils hiss, thrash once, and dissipate like smoke in sunlight. And then the treetops giggle. Four tiny figures dart into view on frost-covered wings, faces fixed in mischievous grins, fingers glowing with cold magic: </w:t>
+        <w:t xml:space="preserve">. The </w:t>
       </w:r>
       <w:r>
         <w:rPr>
@@ -2617,7 +4459,7 @@
           <w:color w:val="222222"/>
           <w:sz w:val="21"/>
         </w:rPr>
-        <w:t>Frostbite Pixies</w:t>
+        <w:t>Frostpine Glade</w:t>
       </w:r>
       <w:r>
         <w:rPr>
@@ -2627,27 +4469,27 @@
           <w:color w:val="222222"/>
           <w:sz w:val="21"/>
         </w:rPr>
-        <w:t>, flinging rays of frost and turning invisible mid-cackle. It is the silliest, slipperiest fight of the winter, and the party wins it laughing.</w:t>
-      </w:r>
-    </w:p>
-    <w:p>
-      <w:pPr>
-        <w:pBdr>
-          <w:left w:val="single" w:sz="18" w:space="12" w:color="5B2A86"/>
-        </w:pBdr>
-        <w:shd w:val="clear" w:color="auto" w:fill="F4F0FA"/>
-        <w:spacing w:before="30" w:after="70"/>
-        <w:ind w:left="340" w:right="340"/>
-      </w:pPr>
+        <w:t xml:space="preserve">, where ancient pines have twisted under frost and shadow. The </w:t>
+      </w:r>
+      <w:r>
+        <w:rPr>
+          <w:rFonts w:ascii="Georgia" w:hAnsi="Georgia" w:cs="Georgia"/>
+          <w:b/>
+          <w:i w:val="0"/>
+          <w:color w:val="222222"/>
+          <w:sz w:val="21"/>
+        </w:rPr>
+        <w:t>Crystalbrook Stream</w:t>
+      </w:r>
       <w:r>
         <w:rPr>
           <w:rFonts w:ascii="Georgia" w:hAnsi="Georgia" w:cs="Georgia"/>
           <w:b w:val="0"/>
           <w:i w:val="0"/>
           <w:color w:val="222222"/>
-          <w:sz w:val="19"/>
-        </w:rPr>
-        <w:t xml:space="preserve">▶ Second carol lock, then </w:t>
+          <w:sz w:val="21"/>
+        </w:rPr>
+        <w:t xml:space="preserve">, where dark tendrils lurk beneath the ice. The </w:t>
       </w:r>
       <w:r>
         <w:rPr>
@@ -2655,9 +4497,9 @@
           <w:b/>
           <w:i w:val="0"/>
           <w:color w:val="222222"/>
-          <w:sz w:val="19"/>
-        </w:rPr>
-        <w:t>4 Frostbite Pixies</w:t>
+          <w:sz w:val="21"/>
+        </w:rPr>
+        <w:t>Whispering Hollow</w:t>
       </w:r>
       <w:r>
         <w:rPr>
@@ -2665,24 +4507,9 @@
           <w:b w:val="0"/>
           <w:i w:val="0"/>
           <w:color w:val="222222"/>
-          <w:sz w:val="19"/>
-        </w:rPr>
-        <w:t xml:space="preserve"> (Ray of Frost, invisibility, slick ice underfoot). Second barrier down.</w:t>
-      </w:r>
-    </w:p>
-    <w:p>
-      <w:pPr>
-        <w:keepNext/>
-        <w:spacing w:before="220" w:after="60"/>
-      </w:pPr>
-      <w:r>
-        <w:rPr>
-          <w:rFonts w:ascii="Georgia" w:hAnsi="Georgia" w:cs="Georgia"/>
-          <w:b/>
-          <w:color w:val="A0522D"/>
-          <w:sz w:val="26"/>
-        </w:rPr>
-        <w:t>The Whispering Hollow: Silent Night</w:t>
+          <w:sz w:val="21"/>
+        </w:rPr>
+        <w:t>, where the very stones whisper despair. Travel to each. Ring the bells. Shatter the barriers. Only then can the Krampusshade be banished for good. His minions will not let you pass easily. But I have faith in you. You carry the light of hope, even in the deepest winter.”</w:t>
       </w:r>
     </w:p>
     <w:p>
@@ -2702,7 +4529,55 @@
           <w:color w:val="222222"/>
           <w:sz w:val="21"/>
         </w:rPr>
-        <w:t>The last barrier waits between two snow-covered hills, in a hollow where the wind whistles words no one can quite make out. A ring of frost-covered standing stones rises at its heart, their old protective runes blackened and writhing. Above the stones churns a slow vortex of shadow, radiating waves of cold that sap warmth and hope together.</w:t>
+        <w:t>Faelan raises his hands, and a soft silver light washes over each of you, warmth seeping into your bones. “Go now, brave souls. May the bells guide you, and may Elaria's light shield you from the shadows.”</w:t>
+      </w:r>
+    </w:p>
+    <w:p>
+      <w:pPr>
+        <w:keepNext/>
+        <w:spacing w:before="400" w:after="120"/>
+        <w:pBdr>
+          <w:bottom w:val="single" w:sz="6" w:space="4" w:color="B8860B"/>
+        </w:pBdr>
+      </w:pPr>
+      <w:r>
+        <w:rPr>
+          <w:rFonts w:ascii="Georgia" w:hAnsi="Georgia" w:cs="Georgia"/>
+          <w:b/>
+          <w:color w:val="B8860B"/>
+          <w:sz w:val="32"/>
+        </w:rPr>
+        <w:t>Part Four: The Three Barriers of Darkness</w:t>
+      </w:r>
+    </w:p>
+    <w:p>
+      <w:pPr>
+        <w:spacing w:before="120" w:after="200"/>
+      </w:pPr>
+      <w:r>
+        <w:rPr>
+          <w:rFonts w:ascii="Georgia" w:hAnsi="Georgia" w:cs="Georgia"/>
+          <w:b w:val="0"/>
+          <w:i/>
+          <w:color w:val="222222"/>
+          <w:sz w:val="21"/>
+        </w:rPr>
+        <w:t>Three marks on a map, eight bells, and one long winter day: the heroes went out into the white silence to take the Krampusshade's power apart, one song at a time.</w:t>
+      </w:r>
+    </w:p>
+    <w:p>
+      <w:pPr>
+        <w:keepNext/>
+        <w:spacing w:before="220" w:after="60"/>
+      </w:pPr>
+      <w:r>
+        <w:rPr>
+          <w:rFonts w:ascii="Georgia" w:hAnsi="Georgia" w:cs="Georgia"/>
+          <w:b/>
+          <w:color w:val="A0522D"/>
+          <w:sz w:val="26"/>
+        </w:rPr>
+        <w:t>The Frostpine Glade: Jingle Bells</w:t>
       </w:r>
     </w:p>
     <w:p>
@@ -2722,27 +4597,7 @@
           <w:color w:val="222222"/>
           <w:sz w:val="21"/>
         </w:rPr>
-        <w:t xml:space="preserve">This song cannot be loud. The heroes play </w:t>
-      </w:r>
-      <w:r>
-        <w:rPr>
-          <w:rFonts w:ascii="Georgia" w:hAnsi="Georgia" w:cs="Georgia"/>
-          <w:b/>
-          <w:i w:val="0"/>
-          <w:color w:val="222222"/>
-          <w:sz w:val="21"/>
-        </w:rPr>
-        <w:t>Silent Night</w:t>
-      </w:r>
-      <w:r>
-        <w:rPr>
-          <w:rFonts w:ascii="Georgia" w:hAnsi="Georgia" w:cs="Georgia"/>
-          <w:b w:val="0"/>
-          <w:i w:val="0"/>
-          <w:color w:val="222222"/>
-          <w:sz w:val="21"/>
-        </w:rPr>
-        <w:t>, slow and gentle, each note held like a candle against the dark. The melody threads through the hollow, and gentle, radiant light washes over the standing stones. The vortex shrieks and dissolves; the blackened runes flicker, then glow their old protective silver.</w:t>
+        <w:t>The pines around the glade creak under armor of ice, and the mist between them curls as though alive. At the center stands a massive frozen pine, its trunk twisted and blackened, jagged chains of black ice wrapped around its roots. On the wind ride faint, mournful whispers: the far-off cries of taken children. The black ice pulses with a sickly blue light, humming a low, wrong-noted mockery of a holiday tune.</w:t>
       </w:r>
     </w:p>
     <w:p>
@@ -2762,7 +4617,7 @@
           <w:color w:val="222222"/>
           <w:sz w:val="21"/>
         </w:rPr>
-        <w:t xml:space="preserve">From the last rags of shadow steps an </w:t>
+        <w:t xml:space="preserve">The answer is the true song. The heroes line up their bells and play it the way it was always meant to sound: </w:t>
       </w:r>
       <w:r>
         <w:rPr>
@@ -2772,7 +4627,7 @@
           <w:color w:val="222222"/>
           <w:sz w:val="21"/>
         </w:rPr>
-        <w:t>Icy Specter</w:t>
+        <w:t>Jingle Bells</w:t>
       </w:r>
       <w:r>
         <w:rPr>
@@ -2782,295 +4637,7 @@
           <w:color w:val="222222"/>
           <w:sz w:val="21"/>
         </w:rPr>
-        <w:t xml:space="preserve">, translucent and wreathed in frost, hollow eyes fixed on the intruders. It fights in whispers and cold hands, wailing despair at the heroes until Ursa's starlight burns through its center and it unravels on the wind. Where it stood, half-buried in the snow, lies a small blackened shard of standing stone that hums against the palm: a </w:t>
-      </w:r>
-      <w:r>
-        <w:rPr>
-          <w:rFonts w:ascii="Georgia" w:hAnsi="Georgia" w:cs="Georgia"/>
-          <w:b/>
-          <w:i w:val="0"/>
-          <w:color w:val="222222"/>
-          <w:sz w:val="21"/>
-        </w:rPr>
-        <w:t>Shadow-Touched Rune Fragment</w:t>
-      </w:r>
-      <w:r>
-        <w:rPr>
-          <w:rFonts w:ascii="Georgia" w:hAnsi="Georgia" w:cs="Georgia"/>
-          <w:b w:val="0"/>
-          <w:i w:val="0"/>
-          <w:color w:val="222222"/>
-          <w:sz w:val="21"/>
-        </w:rPr>
-        <w:t>.</w:t>
-      </w:r>
-    </w:p>
-    <w:p>
-      <w:pPr>
-        <w:pBdr>
-          <w:left w:val="single" w:sz="18" w:space="12" w:color="5B2A86"/>
-        </w:pBdr>
-        <w:shd w:val="clear" w:color="auto" w:fill="F4F0FA"/>
-        <w:spacing w:before="30" w:after="70"/>
-        <w:ind w:left="340" w:right="340"/>
-      </w:pPr>
-      <w:r>
-        <w:rPr>
-          <w:rFonts w:ascii="Georgia" w:hAnsi="Georgia" w:cs="Georgia"/>
-          <w:b w:val="0"/>
-          <w:i w:val="0"/>
-          <w:color w:val="222222"/>
-          <w:sz w:val="19"/>
-        </w:rPr>
-        <w:t xml:space="preserve">▶ Third carol lock, then the </w:t>
-      </w:r>
-      <w:r>
-        <w:rPr>
-          <w:rFonts w:ascii="Georgia" w:hAnsi="Georgia" w:cs="Georgia"/>
-          <w:b/>
-          <w:i w:val="0"/>
-          <w:color w:val="222222"/>
-          <w:sz w:val="19"/>
-        </w:rPr>
-        <w:t>Icy Specter</w:t>
-      </w:r>
-      <w:r>
-        <w:rPr>
-          <w:rFonts w:ascii="Georgia" w:hAnsi="Georgia" w:cs="Georgia"/>
-          <w:b w:val="0"/>
-          <w:i w:val="0"/>
-          <w:color w:val="222222"/>
-          <w:sz w:val="19"/>
-        </w:rPr>
-        <w:t xml:space="preserve"> (Wail of Despair, DC 14 Wisdom). Boon: the </w:t>
-      </w:r>
-      <w:r>
-        <w:rPr>
-          <w:rFonts w:ascii="Georgia" w:hAnsi="Georgia" w:cs="Georgia"/>
-          <w:b/>
-          <w:i w:val="0"/>
-          <w:color w:val="222222"/>
-          <w:sz w:val="19"/>
-        </w:rPr>
-        <w:t>Shadow-Touched Rune Fragment</w:t>
-      </w:r>
-      <w:r>
-        <w:rPr>
-          <w:rFonts w:ascii="Georgia" w:hAnsi="Georgia" w:cs="Georgia"/>
-          <w:b w:val="0"/>
-          <w:i w:val="0"/>
-          <w:color w:val="222222"/>
-          <w:sz w:val="19"/>
-        </w:rPr>
-        <w:t>, advantage on saves against fear for 1 hour while held. Third barrier down.</w:t>
-      </w:r>
-    </w:p>
-    <w:p>
-      <w:pPr>
-        <w:keepNext/>
-        <w:spacing w:before="220" w:after="60"/>
-      </w:pPr>
-      <w:r>
-        <w:rPr>
-          <w:rFonts w:ascii="Georgia" w:hAnsi="Georgia" w:cs="Georgia"/>
-          <w:b/>
-          <w:color w:val="A0522D"/>
-          <w:sz w:val="26"/>
-        </w:rPr>
-        <w:t>The Krampusshade Awakens</w:t>
-      </w:r>
-    </w:p>
-    <w:p>
-      <w:pPr>
-        <w:pBdr>
-          <w:left w:val="single" w:sz="18" w:space="12" w:color="B8860B"/>
-        </w:pBdr>
-        <w:shd w:val="clear" w:color="auto" w:fill="FBF6EA"/>
-        <w:spacing w:before="30" w:after="70"/>
-        <w:ind w:left="340" w:right="340"/>
-      </w:pPr>
-      <w:r>
-        <w:rPr>
-          <w:rFonts w:ascii="Georgia" w:hAnsi="Georgia" w:cs="Georgia"/>
-          <w:b w:val="0"/>
-          <w:i w:val="0"/>
-          <w:color w:val="222222"/>
-          <w:sz w:val="21"/>
-        </w:rPr>
-        <w:t>As the last barrier shatters, an unnatural silence grips the land. The wind dies. The cold bites deeper, down past skin, down to the brave part of you. Far off over Havenmoor, dark clouds swirl into a slow vortex that swallows the stars, and the festival lights of the town flicker and dim, one street at a time. From the gathering dark, two fiery red eyes flare open, and a deep voice oozes across the snow, dripping with mockery.</w:t>
-      </w:r>
-    </w:p>
-    <w:p>
-      <w:pPr>
-        <w:pBdr>
-          <w:left w:val="single" w:sz="18" w:space="12" w:color="B8860B"/>
-        </w:pBdr>
-        <w:shd w:val="clear" w:color="auto" w:fill="FBF6EA"/>
-        <w:spacing w:before="30" w:after="70"/>
-        <w:ind w:left="340" w:right="340"/>
-      </w:pPr>
-      <w:r>
-        <w:rPr>
-          <w:rFonts w:ascii="Georgia" w:hAnsi="Georgia" w:cs="Georgia"/>
-          <w:b/>
-          <w:i w:val="0"/>
-          <w:color w:val="222222"/>
-          <w:sz w:val="21"/>
-        </w:rPr>
-        <w:t>Krampusshade:</w:t>
-      </w:r>
-      <w:r>
-        <w:rPr>
-          <w:rFonts w:ascii="Georgia" w:hAnsi="Georgia" w:cs="Georgia"/>
-          <w:b w:val="0"/>
-          <w:i w:val="0"/>
-          <w:color w:val="222222"/>
-          <w:sz w:val="21"/>
-        </w:rPr>
-        <w:t xml:space="preserve"> “So. You think your bells and lights can banish me? Fools! I feast on despair, and there is plenty yet to devour.”</w:t>
-      </w:r>
-    </w:p>
-    <w:p>
-      <w:pPr>
-        <w:pBdr>
-          <w:left w:val="single" w:sz="18" w:space="12" w:color="B8860B"/>
-        </w:pBdr>
-        <w:shd w:val="clear" w:color="auto" w:fill="FBF6EA"/>
-        <w:spacing w:before="30" w:after="70"/>
-        <w:ind w:left="340" w:right="340"/>
-      </w:pPr>
-      <w:r>
-        <w:rPr>
-          <w:rFonts w:ascii="Georgia" w:hAnsi="Georgia" w:cs="Georgia"/>
-          <w:b w:val="0"/>
-          <w:i w:val="0"/>
-          <w:color w:val="222222"/>
-          <w:sz w:val="21"/>
-        </w:rPr>
-        <w:t>The heroes look at each other for exactly one heartbeat. Then they run.</w:t>
-      </w:r>
-    </w:p>
-    <w:p>
-      <w:pPr>
-        <w:keepNext/>
-        <w:spacing w:before="400" w:after="120"/>
-        <w:pBdr>
-          <w:bottom w:val="single" w:sz="6" w:space="4" w:color="B8860B"/>
-        </w:pBdr>
-      </w:pPr>
-      <w:r>
-        <w:rPr>
-          <w:rFonts w:ascii="Georgia" w:hAnsi="Georgia" w:cs="Georgia"/>
-          <w:b/>
-          <w:color w:val="B8860B"/>
-          <w:sz w:val="32"/>
-        </w:rPr>
-        <w:t>Part Five: The Longest Night</w:t>
-      </w:r>
-    </w:p>
-    <w:p>
-      <w:pPr>
-        <w:spacing w:before="120" w:after="200"/>
-      </w:pPr>
-      <w:r>
-        <w:rPr>
-          <w:rFonts w:ascii="Georgia" w:hAnsi="Georgia" w:cs="Georgia"/>
-          <w:b w:val="0"/>
-          <w:i/>
-          <w:color w:val="222222"/>
-          <w:sz w:val="21"/>
-        </w:rPr>
-        <w:t>Down out of the hills and along the frozen road the four friends raced the darkness home, eight bells jangling in their packs like a heart beating.</w:t>
-      </w:r>
-    </w:p>
-    <w:p>
-      <w:pPr>
-        <w:pBdr>
-          <w:left w:val="single" w:sz="18" w:space="12" w:color="B8860B"/>
-        </w:pBdr>
-        <w:shd w:val="clear" w:color="auto" w:fill="FBF6EA"/>
-        <w:spacing w:before="30" w:after="70"/>
-        <w:ind w:left="340" w:right="340"/>
-      </w:pPr>
-      <w:r>
-        <w:rPr>
-          <w:rFonts w:ascii="Georgia" w:hAnsi="Georgia" w:cs="Georgia"/>
-          <w:b w:val="0"/>
-          <w:i w:val="0"/>
-          <w:color w:val="222222"/>
-          <w:sz w:val="21"/>
-        </w:rPr>
-        <w:t>A thick, unnatural fog rolls through Havenmoor's streets, muffling sound and smearing the lantern light. The villagers are huddled at the Great Pine in the market square, clutching one another, the tree's festive lights guttering weakly against the dark. Somewhere a child's cry echoes, far away and getting farther.</w:t>
-      </w:r>
-    </w:p>
-    <w:p>
-      <w:pPr>
-        <w:pBdr>
-          <w:left w:val="single" w:sz="18" w:space="12" w:color="B8860B"/>
-        </w:pBdr>
-        <w:shd w:val="clear" w:color="auto" w:fill="FBF6EA"/>
-        <w:spacing w:before="30" w:after="70"/>
-        <w:ind w:left="340" w:right="340"/>
-      </w:pPr>
-      <w:r>
-        <w:rPr>
-          <w:rFonts w:ascii="Georgia" w:hAnsi="Georgia" w:cs="Georgia"/>
-          <w:b w:val="0"/>
-          <w:i w:val="0"/>
-          <w:color w:val="222222"/>
-          <w:sz w:val="21"/>
-        </w:rPr>
-        <w:t xml:space="preserve">Then thunder cracks the sky, and the fog peels back like a curtain. Out of the mist steps a towering figure, </w:t>
-      </w:r>
-      <w:r>
-        <w:rPr>
-          <w:rFonts w:ascii="Georgia" w:hAnsi="Georgia" w:cs="Georgia"/>
-          <w:b/>
-          <w:i w:val="0"/>
-          <w:color w:val="222222"/>
-          <w:sz w:val="21"/>
-        </w:rPr>
-        <w:t>ten feet of shadow and frost</w:t>
-      </w:r>
-      <w:r>
-        <w:rPr>
-          <w:rFonts w:ascii="Georgia" w:hAnsi="Georgia" w:cs="Georgia"/>
-          <w:b w:val="0"/>
-          <w:i w:val="0"/>
-          <w:color w:val="222222"/>
-          <w:sz w:val="21"/>
-        </w:rPr>
-        <w:t>: goat-horned, black-furred, icicles dripping from his curved horns, chains swinging from his clawed hands with a sound like cruel sleigh bells. Over his shoulder writhes a burlap sack, and from inside it come the muffled cries of children. The ground cracks with frost where he walks.</w:t>
-      </w:r>
-    </w:p>
-    <w:p>
-      <w:pPr>
-        <w:pBdr>
-          <w:left w:val="single" w:sz="18" w:space="12" w:color="B8860B"/>
-        </w:pBdr>
-        <w:shd w:val="clear" w:color="auto" w:fill="FBF6EA"/>
-        <w:spacing w:before="30" w:after="70"/>
-        <w:ind w:left="340" w:right="340"/>
-      </w:pPr>
-      <w:r>
-        <w:rPr>
-          <w:rFonts w:ascii="Georgia" w:hAnsi="Georgia" w:cs="Georgia"/>
-          <w:b/>
-          <w:i w:val="0"/>
-          <w:color w:val="222222"/>
-          <w:sz w:val="21"/>
-        </w:rPr>
-        <w:t>Krampusshade:</w:t>
-      </w:r>
-      <w:r>
-        <w:rPr>
-          <w:rFonts w:ascii="Georgia" w:hAnsi="Georgia" w:cs="Georgia"/>
-          <w:b w:val="0"/>
-          <w:i w:val="0"/>
-          <w:color w:val="222222"/>
-          <w:sz w:val="21"/>
-        </w:rPr>
-        <w:t xml:space="preserve"> “Your defiance ends here. I will feast on your fear, and the children shall be mine forever!”</w:t>
+        <w:t>, bright and defiant in the dead air. On the last note, golden light bursts from the bells and rolls through the black ice, and the chains shatter with a crack that shakes snow from every branch.</w:t>
       </w:r>
     </w:p>
     <w:p>
@@ -3083,7 +4650,7 @@
         <w:drawing>
           <wp:inline xmlns:a="http://schemas.openxmlformats.org/drawingml/2006/main" xmlns:pic="http://schemas.openxmlformats.org/drawingml/2006/picture">
             <wp:extent cx="3566160" cy="3566160"/>
-            <wp:docPr id="7" name="Picture 7"/>
+            <wp:docPr id="14" name="Picture 14"/>
             <wp:cNvGraphicFramePr>
               <a:graphicFrameLocks noChangeAspect="1"/>
             </wp:cNvGraphicFramePr>
@@ -3095,7 +4662,7 @@
                     <pic:cNvPicPr/>
                   </pic:nvPicPr>
                   <pic:blipFill>
-                    <a:blip r:embed="rId16"/>
+                    <a:blip r:embed="rId23"/>
                     <a:stretch>
                       <a:fillRect/>
                     </a:stretch>
@@ -3126,22 +4693,7 @@
           <w:color w:val="888888"/>
           <w:sz w:val="18"/>
         </w:rPr>
-        <w:t>The Krampusshade comes for Havenmoor.</w:t>
-      </w:r>
-    </w:p>
-    <w:p>
-      <w:pPr>
-        <w:keepNext/>
-        <w:spacing w:before="220" w:after="60"/>
-      </w:pPr>
-      <w:r>
-        <w:rPr>
-          <w:rFonts w:ascii="Georgia" w:hAnsi="Georgia" w:cs="Georgia"/>
-          <w:b/>
-          <w:color w:val="A0522D"/>
-          <w:sz w:val="26"/>
-        </w:rPr>
-        <w:t>The Bells' Harmony</w:t>
+        <w:t>Bells raised, the heroes play the true song, and Elaria's light unmakes the barrier of darkness.</w:t>
       </w:r>
     </w:p>
     <w:p>
@@ -3161,7 +4713,82 @@
           <w:color w:val="222222"/>
           <w:sz w:val="21"/>
         </w:rPr>
-        <w:t>He slams his claws together and freezing power rolls across the square; his chains lash out like serpents, and shadow imps come boiling up out of the fog around him, eyes burning. But the heroes did not come to be afraid. They came to finish a song.</w:t>
+        <w:t xml:space="preserve">The mist answers back. It gathers itself into three snarling shapes: </w:t>
+      </w:r>
+      <w:r>
+        <w:rPr>
+          <w:rFonts w:ascii="Georgia" w:hAnsi="Georgia" w:cs="Georgia"/>
+          <w:b/>
+          <w:i w:val="0"/>
+          <w:color w:val="222222"/>
+          <w:sz w:val="21"/>
+        </w:rPr>
+        <w:t>Frozen Wolves</w:t>
+      </w:r>
+      <w:r>
+        <w:rPr>
+          <w:rFonts w:ascii="Georgia" w:hAnsi="Georgia" w:cs="Georgia"/>
+          <w:b w:val="0"/>
+          <w:i w:val="0"/>
+          <w:color w:val="222222"/>
+          <w:sz w:val="21"/>
+        </w:rPr>
+        <w:t>, frost-armored, eyes burning icy blue, guardians grown from the Krampusshade's own cold. The fight is knives and starlight on slick ground, wolf breath rolling white and freezing, until the last wolf comes apart into glittering mist, and the glade breathes again.</w:t>
+      </w:r>
+    </w:p>
+    <w:p>
+      <w:pPr>
+        <w:pBdr>
+          <w:left w:val="single" w:sz="18" w:space="12" w:color="5B2A86"/>
+        </w:pBdr>
+        <w:shd w:val="clear" w:color="auto" w:fill="F4F0FA"/>
+        <w:spacing w:before="30" w:after="70"/>
+        <w:ind w:left="340" w:right="340"/>
+      </w:pPr>
+      <w:r>
+        <w:rPr>
+          <w:rFonts w:ascii="Georgia" w:hAnsi="Georgia" w:cs="Georgia"/>
+          <w:b w:val="0"/>
+          <w:i w:val="0"/>
+          <w:color w:val="222222"/>
+          <w:sz w:val="19"/>
+        </w:rPr>
+        <w:t xml:space="preserve">▶ The carol lock: E E E, E E E, E G C D E, F F F F, F E E E. Then </w:t>
+      </w:r>
+      <w:r>
+        <w:rPr>
+          <w:rFonts w:ascii="Georgia" w:hAnsi="Georgia" w:cs="Georgia"/>
+          <w:b/>
+          <w:i w:val="0"/>
+          <w:color w:val="222222"/>
+          <w:sz w:val="19"/>
+        </w:rPr>
+        <w:t>3 Frozen Wolves</w:t>
+      </w:r>
+      <w:r>
+        <w:rPr>
+          <w:rFonts w:ascii="Georgia" w:hAnsi="Georgia" w:cs="Georgia"/>
+          <w:b w:val="0"/>
+          <w:i w:val="0"/>
+          <w:color w:val="222222"/>
+          <w:sz w:val="19"/>
+        </w:rPr>
+        <w:t xml:space="preserve"> (pack tactics, icy ground). First barrier down.</w:t>
+      </w:r>
+    </w:p>
+    <w:p>
+      <w:pPr>
+        <w:keepNext/>
+        <w:spacing w:before="220" w:after="60"/>
+      </w:pPr>
+      <w:r>
+        <w:rPr>
+          <w:rFonts w:ascii="Georgia" w:hAnsi="Georgia" w:cs="Georgia"/>
+          <w:b/>
+          <w:color w:val="A0522D"/>
+          <w:sz w:val="26"/>
+        </w:rPr>
+        <w:t>The Crystalbrook Stream: Deck the Halls</w:t>
       </w:r>
     </w:p>
     <w:p>
@@ -3181,27 +4808,7 @@
           <w:color w:val="222222"/>
           <w:sz w:val="21"/>
         </w:rPr>
-        <w:t xml:space="preserve">While blade, bolt, claw, and starlight hold the imps back, bell after bell rings out through the fog, weaving into the one carol big enough for the moment: the </w:t>
-      </w:r>
-      <w:r>
-        <w:rPr>
-          <w:rFonts w:ascii="Georgia" w:hAnsi="Georgia" w:cs="Georgia"/>
-          <w:b/>
-          <w:i w:val="0"/>
-          <w:color w:val="222222"/>
-          <w:sz w:val="21"/>
-        </w:rPr>
-        <w:t>Carol of the Bells</w:t>
-      </w:r>
-      <w:r>
-        <w:rPr>
-          <w:rFonts w:ascii="Georgia" w:hAnsi="Georgia" w:cs="Georgia"/>
-          <w:b w:val="0"/>
-          <w:i w:val="0"/>
-          <w:color w:val="222222"/>
-          <w:sz w:val="21"/>
-        </w:rPr>
-        <w:t>, eight notes of Elaria's light striking through the dark like lantern beams. With every toll the Krampusshade flinches. Threads of shadow peel from his shoulders like smoke from a dying fire. His chains crack. His outline gutters like a candle flame.</w:t>
+        <w:t>The stream winds through a grove of silver-barked trees, its water glittering under a skin of ice. A rickety wooden bridge crosses at the narrows, and beneath it, dark tendrils snake along the underside of the planks, pulsing. Shadowy shapes flicker under the ice, faces twisted in silent song. Frost blooms across the boards as the party steps up.</w:t>
       </w:r>
     </w:p>
     <w:p>
@@ -3221,7 +4828,122 @@
           <w:color w:val="222222"/>
           <w:sz w:val="21"/>
         </w:rPr>
-        <w:t>Stabby rings a bell in one hand and parries a chain with the other. Lilly's turret keeps time like a drummer. Floraburst shakes her petals and adds one small, clear chime of her own. And on the final note, sung by eight bells in perfect harmony, the fiend's roar breaks in the middle.</w:t>
+        <w:t xml:space="preserve">Eight bells ring out </w:t>
+      </w:r>
+      <w:r>
+        <w:rPr>
+          <w:rFonts w:ascii="Georgia" w:hAnsi="Georgia" w:cs="Georgia"/>
+          <w:b/>
+          <w:i w:val="0"/>
+          <w:color w:val="222222"/>
+          <w:sz w:val="21"/>
+        </w:rPr>
+        <w:t>Deck the Halls</w:t>
+      </w:r>
+      <w:r>
+        <w:rPr>
+          <w:rFonts w:ascii="Georgia" w:hAnsi="Georgia" w:cs="Georgia"/>
+          <w:b w:val="0"/>
+          <w:i w:val="0"/>
+          <w:color w:val="222222"/>
+          <w:sz w:val="21"/>
+        </w:rPr>
+        <w:t xml:space="preserve">, lively and warm, the notes echoing down the frozen water like skaters. The tendrils hiss, thrash once, and dissipate like smoke in sunlight. And then the treetops giggle. Four tiny figures dart into view on frost-covered wings, faces fixed in mischievous grins, fingers glowing with cold magic: </w:t>
+      </w:r>
+      <w:r>
+        <w:rPr>
+          <w:rFonts w:ascii="Georgia" w:hAnsi="Georgia" w:cs="Georgia"/>
+          <w:b/>
+          <w:i w:val="0"/>
+          <w:color w:val="222222"/>
+          <w:sz w:val="21"/>
+        </w:rPr>
+        <w:t>Frostbite Pixies</w:t>
+      </w:r>
+      <w:r>
+        <w:rPr>
+          <w:rFonts w:ascii="Georgia" w:hAnsi="Georgia" w:cs="Georgia"/>
+          <w:b w:val="0"/>
+          <w:i w:val="0"/>
+          <w:color w:val="222222"/>
+          <w:sz w:val="21"/>
+        </w:rPr>
+        <w:t>, flinging rays of frost and turning invisible mid-cackle. It is the silliest, slipperiest fight of the winter, and the party wins it laughing.</w:t>
+      </w:r>
+    </w:p>
+    <w:p>
+      <w:pPr>
+        <w:pBdr>
+          <w:left w:val="single" w:sz="18" w:space="12" w:color="5B2A86"/>
+        </w:pBdr>
+        <w:shd w:val="clear" w:color="auto" w:fill="F4F0FA"/>
+        <w:spacing w:before="30" w:after="70"/>
+        <w:ind w:left="340" w:right="340"/>
+      </w:pPr>
+      <w:r>
+        <w:rPr>
+          <w:rFonts w:ascii="Georgia" w:hAnsi="Georgia" w:cs="Georgia"/>
+          <w:b w:val="0"/>
+          <w:i w:val="0"/>
+          <w:color w:val="222222"/>
+          <w:sz w:val="19"/>
+        </w:rPr>
+        <w:t xml:space="preserve">▶ Second carol lock, then </w:t>
+      </w:r>
+      <w:r>
+        <w:rPr>
+          <w:rFonts w:ascii="Georgia" w:hAnsi="Georgia" w:cs="Georgia"/>
+          <w:b/>
+          <w:i w:val="0"/>
+          <w:color w:val="222222"/>
+          <w:sz w:val="19"/>
+        </w:rPr>
+        <w:t>4 Frostbite Pixies</w:t>
+      </w:r>
+      <w:r>
+        <w:rPr>
+          <w:rFonts w:ascii="Georgia" w:hAnsi="Georgia" w:cs="Georgia"/>
+          <w:b w:val="0"/>
+          <w:i w:val="0"/>
+          <w:color w:val="222222"/>
+          <w:sz w:val="19"/>
+        </w:rPr>
+        <w:t xml:space="preserve"> (Ray of Frost, invisibility, slick ice underfoot). Second barrier down.</w:t>
+      </w:r>
+    </w:p>
+    <w:p>
+      <w:pPr>
+        <w:keepNext/>
+        <w:spacing w:before="220" w:after="60"/>
+      </w:pPr>
+      <w:r>
+        <w:rPr>
+          <w:rFonts w:ascii="Georgia" w:hAnsi="Georgia" w:cs="Georgia"/>
+          <w:b/>
+          <w:color w:val="A0522D"/>
+          <w:sz w:val="26"/>
+        </w:rPr>
+        <w:t>The Whispering Hollow: Silent Night</w:t>
+      </w:r>
+    </w:p>
+    <w:p>
+      <w:pPr>
+        <w:pBdr>
+          <w:left w:val="single" w:sz="18" w:space="12" w:color="B8860B"/>
+        </w:pBdr>
+        <w:shd w:val="clear" w:color="auto" w:fill="FBF6EA"/>
+        <w:spacing w:before="30" w:after="70"/>
+        <w:ind w:left="340" w:right="340"/>
+      </w:pPr>
+      <w:r>
+        <w:rPr>
+          <w:rFonts w:ascii="Georgia" w:hAnsi="Georgia" w:cs="Georgia"/>
+          <w:b w:val="0"/>
+          <w:i w:val="0"/>
+          <w:color w:val="222222"/>
+          <w:sz w:val="21"/>
+        </w:rPr>
+        <w:t>The last barrier waits between two snow-covered hills, in a hollow where the wind whistles words no one can quite make out. A ring of frost-covered standing stones rises at its heart, their old protective runes blackened and writhing. Above the stones churns a slow vortex of shadow, radiating waves of cold that sap warmth and hope together.</w:t>
       </w:r>
     </w:p>
     <w:p>
@@ -3233,8 +4955,8 @@
       <w:r>
         <w:drawing>
           <wp:inline xmlns:a="http://schemas.openxmlformats.org/drawingml/2006/main" xmlns:pic="http://schemas.openxmlformats.org/drawingml/2006/picture">
-            <wp:extent cx="3017520" cy="3017520"/>
-            <wp:docPr id="8" name="Picture 8"/>
+            <wp:extent cx="3291840" cy="3291840"/>
+            <wp:docPr id="15" name="Picture 15"/>
             <wp:cNvGraphicFramePr>
               <a:graphicFrameLocks noChangeAspect="1"/>
             </wp:cNvGraphicFramePr>
@@ -3246,7 +4968,638 @@
                     <pic:cNvPicPr/>
                   </pic:nvPicPr>
                   <pic:blipFill>
-                    <a:blip r:embed="rId17"/>
+                    <a:blip r:embed="rId24"/>
+                    <a:stretch>
+                      <a:fillRect/>
+                    </a:stretch>
+                  </pic:blipFill>
+                  <pic:spPr>
+                    <a:xfrm>
+                      <a:off x="0" y="0"/>
+                      <a:ext cx="3291840" cy="3291840"/>
+                    </a:xfrm>
+                    <a:prstGeom prst="rect"/>
+                  </pic:spPr>
+                </pic:pic>
+              </a:graphicData>
+            </a:graphic>
+          </wp:inline>
+        </w:drawing>
+      </w:r>
+    </w:p>
+    <w:p>
+      <w:pPr>
+        <w:spacing w:after="140"/>
+        <w:jc w:val="center"/>
+      </w:pPr>
+      <w:r>
+        <w:rPr>
+          <w:rFonts w:ascii="Georgia" w:hAnsi="Georgia" w:cs="Georgia"/>
+          <w:i/>
+          <w:color w:val="888888"/>
+          <w:sz w:val="18"/>
+        </w:rPr>
+        <w:t>The Whispering Hollow, where blackened runes writhe on the standing stones and a vortex of shadow churns above.</w:t>
+      </w:r>
+    </w:p>
+    <w:p>
+      <w:pPr>
+        <w:pBdr>
+          <w:left w:val="single" w:sz="18" w:space="12" w:color="B8860B"/>
+        </w:pBdr>
+        <w:shd w:val="clear" w:color="auto" w:fill="FBF6EA"/>
+        <w:spacing w:before="30" w:after="70"/>
+        <w:ind w:left="340" w:right="340"/>
+      </w:pPr>
+      <w:r>
+        <w:rPr>
+          <w:rFonts w:ascii="Georgia" w:hAnsi="Georgia" w:cs="Georgia"/>
+          <w:b w:val="0"/>
+          <w:i w:val="0"/>
+          <w:color w:val="222222"/>
+          <w:sz w:val="21"/>
+        </w:rPr>
+        <w:t xml:space="preserve">This song cannot be loud. The heroes play </w:t>
+      </w:r>
+      <w:r>
+        <w:rPr>
+          <w:rFonts w:ascii="Georgia" w:hAnsi="Georgia" w:cs="Georgia"/>
+          <w:b/>
+          <w:i w:val="0"/>
+          <w:color w:val="222222"/>
+          <w:sz w:val="21"/>
+        </w:rPr>
+        <w:t>Silent Night</w:t>
+      </w:r>
+      <w:r>
+        <w:rPr>
+          <w:rFonts w:ascii="Georgia" w:hAnsi="Georgia" w:cs="Georgia"/>
+          <w:b w:val="0"/>
+          <w:i w:val="0"/>
+          <w:color w:val="222222"/>
+          <w:sz w:val="21"/>
+        </w:rPr>
+        <w:t>, slow and gentle, each note held like a candle against the dark. The melody threads through the hollow, and gentle, radiant light washes over the standing stones. The vortex shrieks and dissolves; the blackened runes flicker, then glow their old protective silver.</w:t>
+      </w:r>
+    </w:p>
+    <w:p>
+      <w:pPr>
+        <w:pBdr>
+          <w:left w:val="single" w:sz="18" w:space="12" w:color="B8860B"/>
+        </w:pBdr>
+        <w:shd w:val="clear" w:color="auto" w:fill="FBF6EA"/>
+        <w:spacing w:before="30" w:after="70"/>
+        <w:ind w:left="340" w:right="340"/>
+      </w:pPr>
+      <w:r>
+        <w:rPr>
+          <w:rFonts w:ascii="Georgia" w:hAnsi="Georgia" w:cs="Georgia"/>
+          <w:b w:val="0"/>
+          <w:i w:val="0"/>
+          <w:color w:val="222222"/>
+          <w:sz w:val="21"/>
+        </w:rPr>
+        <w:t xml:space="preserve">From the last rags of shadow steps an </w:t>
+      </w:r>
+      <w:r>
+        <w:rPr>
+          <w:rFonts w:ascii="Georgia" w:hAnsi="Georgia" w:cs="Georgia"/>
+          <w:b/>
+          <w:i w:val="0"/>
+          <w:color w:val="222222"/>
+          <w:sz w:val="21"/>
+        </w:rPr>
+        <w:t>Icy Specter</w:t>
+      </w:r>
+      <w:r>
+        <w:rPr>
+          <w:rFonts w:ascii="Georgia" w:hAnsi="Georgia" w:cs="Georgia"/>
+          <w:b w:val="0"/>
+          <w:i w:val="0"/>
+          <w:color w:val="222222"/>
+          <w:sz w:val="21"/>
+        </w:rPr>
+        <w:t xml:space="preserve">, translucent and wreathed in frost, hollow eyes fixed on the intruders. It fights in whispers and cold hands, wailing despair at the heroes until Ursa's starlight burns through its center and it unravels on the wind. Where it stood, half-buried in the snow, lies a small blackened shard of standing stone that hums against the palm: a </w:t>
+      </w:r>
+      <w:r>
+        <w:rPr>
+          <w:rFonts w:ascii="Georgia" w:hAnsi="Georgia" w:cs="Georgia"/>
+          <w:b/>
+          <w:i w:val="0"/>
+          <w:color w:val="222222"/>
+          <w:sz w:val="21"/>
+        </w:rPr>
+        <w:t>Shadow-Touched Rune Fragment</w:t>
+      </w:r>
+      <w:r>
+        <w:rPr>
+          <w:rFonts w:ascii="Georgia" w:hAnsi="Georgia" w:cs="Georgia"/>
+          <w:b w:val="0"/>
+          <w:i w:val="0"/>
+          <w:color w:val="222222"/>
+          <w:sz w:val="21"/>
+        </w:rPr>
+        <w:t>.</w:t>
+      </w:r>
+    </w:p>
+    <w:p>
+      <w:pPr>
+        <w:pBdr>
+          <w:left w:val="single" w:sz="18" w:space="12" w:color="5B2A86"/>
+        </w:pBdr>
+        <w:shd w:val="clear" w:color="auto" w:fill="F4F0FA"/>
+        <w:spacing w:before="30" w:after="70"/>
+        <w:ind w:left="340" w:right="340"/>
+      </w:pPr>
+      <w:r>
+        <w:rPr>
+          <w:rFonts w:ascii="Georgia" w:hAnsi="Georgia" w:cs="Georgia"/>
+          <w:b w:val="0"/>
+          <w:i w:val="0"/>
+          <w:color w:val="222222"/>
+          <w:sz w:val="19"/>
+        </w:rPr>
+        <w:t xml:space="preserve">▶ Third carol lock, then the </w:t>
+      </w:r>
+      <w:r>
+        <w:rPr>
+          <w:rFonts w:ascii="Georgia" w:hAnsi="Georgia" w:cs="Georgia"/>
+          <w:b/>
+          <w:i w:val="0"/>
+          <w:color w:val="222222"/>
+          <w:sz w:val="19"/>
+        </w:rPr>
+        <w:t>Icy Specter</w:t>
+      </w:r>
+      <w:r>
+        <w:rPr>
+          <w:rFonts w:ascii="Georgia" w:hAnsi="Georgia" w:cs="Georgia"/>
+          <w:b w:val="0"/>
+          <w:i w:val="0"/>
+          <w:color w:val="222222"/>
+          <w:sz w:val="19"/>
+        </w:rPr>
+        <w:t xml:space="preserve"> (Wail of Despair, DC 14 Wisdom). Boon: the </w:t>
+      </w:r>
+      <w:r>
+        <w:rPr>
+          <w:rFonts w:ascii="Georgia" w:hAnsi="Georgia" w:cs="Georgia"/>
+          <w:b/>
+          <w:i w:val="0"/>
+          <w:color w:val="222222"/>
+          <w:sz w:val="19"/>
+        </w:rPr>
+        <w:t>Shadow-Touched Rune Fragment</w:t>
+      </w:r>
+      <w:r>
+        <w:rPr>
+          <w:rFonts w:ascii="Georgia" w:hAnsi="Georgia" w:cs="Georgia"/>
+          <w:b w:val="0"/>
+          <w:i w:val="0"/>
+          <w:color w:val="222222"/>
+          <w:sz w:val="19"/>
+        </w:rPr>
+        <w:t>, advantage on saves against fear for 1 hour while held. Third barrier down.</w:t>
+      </w:r>
+    </w:p>
+    <w:p>
+      <w:pPr>
+        <w:keepNext/>
+        <w:spacing w:before="220" w:after="60"/>
+      </w:pPr>
+      <w:r>
+        <w:rPr>
+          <w:rFonts w:ascii="Georgia" w:hAnsi="Georgia" w:cs="Georgia"/>
+          <w:b/>
+          <w:color w:val="A0522D"/>
+          <w:sz w:val="26"/>
+        </w:rPr>
+        <w:t>The Krampusshade Awakens</w:t>
+      </w:r>
+    </w:p>
+    <w:p>
+      <w:pPr>
+        <w:pBdr>
+          <w:left w:val="single" w:sz="18" w:space="12" w:color="B8860B"/>
+        </w:pBdr>
+        <w:shd w:val="clear" w:color="auto" w:fill="FBF6EA"/>
+        <w:spacing w:before="30" w:after="70"/>
+        <w:ind w:left="340" w:right="340"/>
+      </w:pPr>
+      <w:r>
+        <w:rPr>
+          <w:rFonts w:ascii="Georgia" w:hAnsi="Georgia" w:cs="Georgia"/>
+          <w:b w:val="0"/>
+          <w:i w:val="0"/>
+          <w:color w:val="222222"/>
+          <w:sz w:val="21"/>
+        </w:rPr>
+        <w:t>As the last barrier shatters, an unnatural silence grips the land. The wind dies. The cold bites deeper, down past skin, down to the brave part of you. Far off over Havenmoor, dark clouds swirl into a slow vortex that swallows the stars, and the festival lights of the town flicker and dim, one street at a time. From the gathering dark, two fiery red eyes flare open, and a deep voice oozes across the snow, dripping with mockery.</w:t>
+      </w:r>
+    </w:p>
+    <w:p>
+      <w:pPr>
+        <w:pBdr>
+          <w:left w:val="single" w:sz="18" w:space="12" w:color="B8860B"/>
+        </w:pBdr>
+        <w:shd w:val="clear" w:color="auto" w:fill="FBF6EA"/>
+        <w:spacing w:before="30" w:after="70"/>
+        <w:ind w:left="340" w:right="340"/>
+      </w:pPr>
+      <w:r>
+        <w:rPr>
+          <w:rFonts w:ascii="Georgia" w:hAnsi="Georgia" w:cs="Georgia"/>
+          <w:b/>
+          <w:i w:val="0"/>
+          <w:color w:val="222222"/>
+          <w:sz w:val="21"/>
+        </w:rPr>
+        <w:t>Krampusshade:</w:t>
+      </w:r>
+      <w:r>
+        <w:rPr>
+          <w:rFonts w:ascii="Georgia" w:hAnsi="Georgia" w:cs="Georgia"/>
+          <w:b w:val="0"/>
+          <w:i w:val="0"/>
+          <w:color w:val="222222"/>
+          <w:sz w:val="21"/>
+        </w:rPr>
+        <w:t xml:space="preserve"> “So. You think your bells and lights can banish me? Fools! I feast on despair, and there is plenty yet to devour.”</w:t>
+      </w:r>
+    </w:p>
+    <w:p>
+      <w:pPr>
+        <w:keepNext/>
+        <w:spacing w:before="120" w:after="40"/>
+        <w:jc w:val="center"/>
+      </w:pPr>
+      <w:r>
+        <w:drawing>
+          <wp:inline xmlns:a="http://schemas.openxmlformats.org/drawingml/2006/main" xmlns:pic="http://schemas.openxmlformats.org/drawingml/2006/picture">
+            <wp:extent cx="3291840" cy="3291840"/>
+            <wp:docPr id="16" name="Picture 16"/>
+            <wp:cNvGraphicFramePr>
+              <a:graphicFrameLocks noChangeAspect="1"/>
+            </wp:cNvGraphicFramePr>
+            <a:graphic>
+              <a:graphicData uri="http://schemas.openxmlformats.org/drawingml/2006/picture">
+                <pic:pic>
+                  <pic:nvPicPr>
+                    <pic:cNvPr id="0" name="image.jpg"/>
+                    <pic:cNvPicPr/>
+                  </pic:nvPicPr>
+                  <pic:blipFill>
+                    <a:blip r:embed="rId25"/>
+                    <a:stretch>
+                      <a:fillRect/>
+                    </a:stretch>
+                  </pic:blipFill>
+                  <pic:spPr>
+                    <a:xfrm>
+                      <a:off x="0" y="0"/>
+                      <a:ext cx="3291840" cy="3291840"/>
+                    </a:xfrm>
+                    <a:prstGeom prst="rect"/>
+                  </pic:spPr>
+                </pic:pic>
+              </a:graphicData>
+            </a:graphic>
+          </wp:inline>
+        </w:drawing>
+      </w:r>
+    </w:p>
+    <w:p>
+      <w:pPr>
+        <w:spacing w:after="140"/>
+        <w:jc w:val="center"/>
+      </w:pPr>
+      <w:r>
+        <w:rPr>
+          <w:rFonts w:ascii="Georgia" w:hAnsi="Georgia" w:cs="Georgia"/>
+          <w:i/>
+          <w:color w:val="888888"/>
+          <w:sz w:val="18"/>
+        </w:rPr>
+        <w:t>Above the festival lights of Havenmoor, the Krampusshade gathers out of the storm.</w:t>
+      </w:r>
+    </w:p>
+    <w:p>
+      <w:pPr>
+        <w:pBdr>
+          <w:left w:val="single" w:sz="18" w:space="12" w:color="B8860B"/>
+        </w:pBdr>
+        <w:shd w:val="clear" w:color="auto" w:fill="FBF6EA"/>
+        <w:spacing w:before="30" w:after="70"/>
+        <w:ind w:left="340" w:right="340"/>
+      </w:pPr>
+      <w:r>
+        <w:rPr>
+          <w:rFonts w:ascii="Georgia" w:hAnsi="Georgia" w:cs="Georgia"/>
+          <w:b w:val="0"/>
+          <w:i w:val="0"/>
+          <w:color w:val="222222"/>
+          <w:sz w:val="21"/>
+        </w:rPr>
+        <w:t>The heroes look at each other for exactly one heartbeat. Then they run.</w:t>
+      </w:r>
+    </w:p>
+    <w:p>
+      <w:pPr>
+        <w:keepNext/>
+        <w:spacing w:before="400" w:after="120"/>
+        <w:pBdr>
+          <w:bottom w:val="single" w:sz="6" w:space="4" w:color="B8860B"/>
+        </w:pBdr>
+      </w:pPr>
+      <w:r>
+        <w:rPr>
+          <w:rFonts w:ascii="Georgia" w:hAnsi="Georgia" w:cs="Georgia"/>
+          <w:b/>
+          <w:color w:val="B8860B"/>
+          <w:sz w:val="32"/>
+        </w:rPr>
+        <w:t>Part Five: The Longest Night</w:t>
+      </w:r>
+    </w:p>
+    <w:p>
+      <w:pPr>
+        <w:spacing w:before="120" w:after="200"/>
+      </w:pPr>
+      <w:r>
+        <w:rPr>
+          <w:rFonts w:ascii="Georgia" w:hAnsi="Georgia" w:cs="Georgia"/>
+          <w:b w:val="0"/>
+          <w:i/>
+          <w:color w:val="222222"/>
+          <w:sz w:val="21"/>
+        </w:rPr>
+        <w:t>Down out of the hills and along the frozen road the four friends raced the darkness home, eight bells jangling in their packs like a heart beating.</w:t>
+      </w:r>
+    </w:p>
+    <w:p>
+      <w:pPr>
+        <w:pBdr>
+          <w:left w:val="single" w:sz="18" w:space="12" w:color="B8860B"/>
+        </w:pBdr>
+        <w:shd w:val="clear" w:color="auto" w:fill="FBF6EA"/>
+        <w:spacing w:before="30" w:after="70"/>
+        <w:ind w:left="340" w:right="340"/>
+      </w:pPr>
+      <w:r>
+        <w:rPr>
+          <w:rFonts w:ascii="Georgia" w:hAnsi="Georgia" w:cs="Georgia"/>
+          <w:b w:val="0"/>
+          <w:i w:val="0"/>
+          <w:color w:val="222222"/>
+          <w:sz w:val="21"/>
+        </w:rPr>
+        <w:t>A thick, unnatural fog rolls through Havenmoor's streets, muffling sound and smearing the lantern light. The villagers are huddled at the Great Pine in the market square, clutching one another, the tree's festive lights guttering weakly against the dark. Somewhere a child's cry echoes, far away and getting farther.</w:t>
+      </w:r>
+    </w:p>
+    <w:p>
+      <w:pPr>
+        <w:pBdr>
+          <w:left w:val="single" w:sz="18" w:space="12" w:color="B8860B"/>
+        </w:pBdr>
+        <w:shd w:val="clear" w:color="auto" w:fill="FBF6EA"/>
+        <w:spacing w:before="30" w:after="70"/>
+        <w:ind w:left="340" w:right="340"/>
+      </w:pPr>
+      <w:r>
+        <w:rPr>
+          <w:rFonts w:ascii="Georgia" w:hAnsi="Georgia" w:cs="Georgia"/>
+          <w:b w:val="0"/>
+          <w:i w:val="0"/>
+          <w:color w:val="222222"/>
+          <w:sz w:val="21"/>
+        </w:rPr>
+        <w:t xml:space="preserve">Then thunder cracks the sky, and the fog peels back like a curtain. Out of the mist steps a towering figure, </w:t>
+      </w:r>
+      <w:r>
+        <w:rPr>
+          <w:rFonts w:ascii="Georgia" w:hAnsi="Georgia" w:cs="Georgia"/>
+          <w:b/>
+          <w:i w:val="0"/>
+          <w:color w:val="222222"/>
+          <w:sz w:val="21"/>
+        </w:rPr>
+        <w:t>ten feet of shadow and frost</w:t>
+      </w:r>
+      <w:r>
+        <w:rPr>
+          <w:rFonts w:ascii="Georgia" w:hAnsi="Georgia" w:cs="Georgia"/>
+          <w:b w:val="0"/>
+          <w:i w:val="0"/>
+          <w:color w:val="222222"/>
+          <w:sz w:val="21"/>
+        </w:rPr>
+        <w:t>: goat-horned, black-furred, icicles dripping from his curved horns, chains swinging from his clawed hands with a sound like cruel sleigh bells. Over his shoulder writhes a burlap sack, and from inside it come the muffled cries of children. The ground cracks with frost where he walks.</w:t>
+      </w:r>
+    </w:p>
+    <w:p>
+      <w:pPr>
+        <w:pBdr>
+          <w:left w:val="single" w:sz="18" w:space="12" w:color="B8860B"/>
+        </w:pBdr>
+        <w:shd w:val="clear" w:color="auto" w:fill="FBF6EA"/>
+        <w:spacing w:before="30" w:after="70"/>
+        <w:ind w:left="340" w:right="340"/>
+      </w:pPr>
+      <w:r>
+        <w:rPr>
+          <w:rFonts w:ascii="Georgia" w:hAnsi="Georgia" w:cs="Georgia"/>
+          <w:b/>
+          <w:i w:val="0"/>
+          <w:color w:val="222222"/>
+          <w:sz w:val="21"/>
+        </w:rPr>
+        <w:t>Krampusshade:</w:t>
+      </w:r>
+      <w:r>
+        <w:rPr>
+          <w:rFonts w:ascii="Georgia" w:hAnsi="Georgia" w:cs="Georgia"/>
+          <w:b w:val="0"/>
+          <w:i w:val="0"/>
+          <w:color w:val="222222"/>
+          <w:sz w:val="21"/>
+        </w:rPr>
+        <w:t xml:space="preserve"> “Your defiance ends here. I will feast on your fear, and the children shall be mine forever!”</w:t>
+      </w:r>
+    </w:p>
+    <w:p>
+      <w:pPr>
+        <w:keepNext/>
+        <w:spacing w:before="120" w:after="40"/>
+        <w:jc w:val="center"/>
+      </w:pPr>
+      <w:r>
+        <w:drawing>
+          <wp:inline xmlns:a="http://schemas.openxmlformats.org/drawingml/2006/main" xmlns:pic="http://schemas.openxmlformats.org/drawingml/2006/picture">
+            <wp:extent cx="3566160" cy="3566160"/>
+            <wp:docPr id="17" name="Picture 17"/>
+            <wp:cNvGraphicFramePr>
+              <a:graphicFrameLocks noChangeAspect="1"/>
+            </wp:cNvGraphicFramePr>
+            <a:graphic>
+              <a:graphicData uri="http://schemas.openxmlformats.org/drawingml/2006/picture">
+                <pic:pic>
+                  <pic:nvPicPr>
+                    <pic:cNvPr id="0" name="image.jpg"/>
+                    <pic:cNvPicPr/>
+                  </pic:nvPicPr>
+                  <pic:blipFill>
+                    <a:blip r:embed="rId26"/>
+                    <a:stretch>
+                      <a:fillRect/>
+                    </a:stretch>
+                  </pic:blipFill>
+                  <pic:spPr>
+                    <a:xfrm>
+                      <a:off x="0" y="0"/>
+                      <a:ext cx="3566160" cy="3566160"/>
+                    </a:xfrm>
+                    <a:prstGeom prst="rect"/>
+                  </pic:spPr>
+                </pic:pic>
+              </a:graphicData>
+            </a:graphic>
+          </wp:inline>
+        </w:drawing>
+      </w:r>
+    </w:p>
+    <w:p>
+      <w:pPr>
+        <w:spacing w:after="140"/>
+        <w:jc w:val="center"/>
+      </w:pPr>
+      <w:r>
+        <w:rPr>
+          <w:rFonts w:ascii="Georgia" w:hAnsi="Georgia" w:cs="Georgia"/>
+          <w:i/>
+          <w:color w:val="888888"/>
+          <w:sz w:val="18"/>
+        </w:rPr>
+        <w:t>The Krampusshade comes for Havenmoor.</w:t>
+      </w:r>
+    </w:p>
+    <w:p>
+      <w:pPr>
+        <w:keepNext/>
+        <w:spacing w:before="220" w:after="60"/>
+      </w:pPr>
+      <w:r>
+        <w:rPr>
+          <w:rFonts w:ascii="Georgia" w:hAnsi="Georgia" w:cs="Georgia"/>
+          <w:b/>
+          <w:color w:val="A0522D"/>
+          <w:sz w:val="26"/>
+        </w:rPr>
+        <w:t>The Bells' Harmony</w:t>
+      </w:r>
+    </w:p>
+    <w:p>
+      <w:pPr>
+        <w:pBdr>
+          <w:left w:val="single" w:sz="18" w:space="12" w:color="B8860B"/>
+        </w:pBdr>
+        <w:shd w:val="clear" w:color="auto" w:fill="FBF6EA"/>
+        <w:spacing w:before="30" w:after="70"/>
+        <w:ind w:left="340" w:right="340"/>
+      </w:pPr>
+      <w:r>
+        <w:rPr>
+          <w:rFonts w:ascii="Georgia" w:hAnsi="Georgia" w:cs="Georgia"/>
+          <w:b w:val="0"/>
+          <w:i w:val="0"/>
+          <w:color w:val="222222"/>
+          <w:sz w:val="21"/>
+        </w:rPr>
+        <w:t>He slams his claws together and freezing power rolls across the square; his chains lash out like serpents, and shadow imps come boiling up out of the fog around him, eyes burning. But the heroes did not come to be afraid. They came to finish a song.</w:t>
+      </w:r>
+    </w:p>
+    <w:p>
+      <w:pPr>
+        <w:pBdr>
+          <w:left w:val="single" w:sz="18" w:space="12" w:color="B8860B"/>
+        </w:pBdr>
+        <w:shd w:val="clear" w:color="auto" w:fill="FBF6EA"/>
+        <w:spacing w:before="30" w:after="70"/>
+        <w:ind w:left="340" w:right="340"/>
+      </w:pPr>
+      <w:r>
+        <w:rPr>
+          <w:rFonts w:ascii="Georgia" w:hAnsi="Georgia" w:cs="Georgia"/>
+          <w:b w:val="0"/>
+          <w:i w:val="0"/>
+          <w:color w:val="222222"/>
+          <w:sz w:val="21"/>
+        </w:rPr>
+        <w:t xml:space="preserve">While blade, bolt, claw, and starlight hold the imps back, bell after bell rings out through the fog, weaving into the one carol big enough for the moment: the </w:t>
+      </w:r>
+      <w:r>
+        <w:rPr>
+          <w:rFonts w:ascii="Georgia" w:hAnsi="Georgia" w:cs="Georgia"/>
+          <w:b/>
+          <w:i w:val="0"/>
+          <w:color w:val="222222"/>
+          <w:sz w:val="21"/>
+        </w:rPr>
+        <w:t>Carol of the Bells</w:t>
+      </w:r>
+      <w:r>
+        <w:rPr>
+          <w:rFonts w:ascii="Georgia" w:hAnsi="Georgia" w:cs="Georgia"/>
+          <w:b w:val="0"/>
+          <w:i w:val="0"/>
+          <w:color w:val="222222"/>
+          <w:sz w:val="21"/>
+        </w:rPr>
+        <w:t>, eight notes of Elaria's light striking through the dark like lantern beams. With every toll the Krampusshade flinches. Threads of shadow peel from his shoulders like smoke from a dying fire. His chains crack. His outline gutters like a candle flame.</w:t>
+      </w:r>
+    </w:p>
+    <w:p>
+      <w:pPr>
+        <w:pBdr>
+          <w:left w:val="single" w:sz="18" w:space="12" w:color="B8860B"/>
+        </w:pBdr>
+        <w:shd w:val="clear" w:color="auto" w:fill="FBF6EA"/>
+        <w:spacing w:before="30" w:after="70"/>
+        <w:ind w:left="340" w:right="340"/>
+      </w:pPr>
+      <w:r>
+        <w:rPr>
+          <w:rFonts w:ascii="Georgia" w:hAnsi="Georgia" w:cs="Georgia"/>
+          <w:b w:val="0"/>
+          <w:i w:val="0"/>
+          <w:color w:val="222222"/>
+          <w:sz w:val="21"/>
+        </w:rPr>
+        <w:t>Stabby rings a bell in one hand and parries a chain with the other. Lilly's turret keeps time like a drummer. Floraburst shakes her petals and adds one small, clear chime of her own. And on the final note, sung by eight bells in perfect harmony, the fiend's roar breaks in the middle.</w:t>
+      </w:r>
+    </w:p>
+    <w:p>
+      <w:pPr>
+        <w:keepNext/>
+        <w:spacing w:before="120" w:after="40"/>
+        <w:jc w:val="center"/>
+      </w:pPr>
+      <w:r>
+        <w:drawing>
+          <wp:inline xmlns:a="http://schemas.openxmlformats.org/drawingml/2006/main" xmlns:pic="http://schemas.openxmlformats.org/drawingml/2006/picture">
+            <wp:extent cx="3017520" cy="3017520"/>
+            <wp:docPr id="18" name="Picture 18"/>
+            <wp:cNvGraphicFramePr>
+              <a:graphicFrameLocks noChangeAspect="1"/>
+            </wp:cNvGraphicFramePr>
+            <a:graphic>
+              <a:graphicData uri="http://schemas.openxmlformats.org/drawingml/2006/picture">
+                <pic:pic>
+                  <pic:nvPicPr>
+                    <pic:cNvPr id="0" name="image.jpg"/>
+                    <pic:cNvPicPr/>
+                  </pic:nvPicPr>
+                  <pic:blipFill>
+                    <a:blip r:embed="rId27"/>
                     <a:stretch>
                       <a:fillRect/>
                     </a:stretch>
@@ -3390,7 +5743,7 @@
         <w:drawing>
           <wp:inline xmlns:a="http://schemas.openxmlformats.org/drawingml/2006/main" xmlns:pic="http://schemas.openxmlformats.org/drawingml/2006/picture">
             <wp:extent cx="3566160" cy="3566160"/>
-            <wp:docPr id="9" name="Picture 9"/>
+            <wp:docPr id="19" name="Picture 19"/>
             <wp:cNvGraphicFramePr>
               <a:graphicFrameLocks noChangeAspect="1"/>
             </wp:cNvGraphicFramePr>
@@ -3402,7 +5755,7 @@
                     <pic:cNvPicPr/>
                   </pic:nvPicPr>
                   <pic:blipFill>
-                    <a:blip r:embed="rId18"/>
+                    <a:blip r:embed="rId28"/>
                     <a:stretch>
                       <a:fillRect/>
                     </a:stretch>
@@ -3756,7 +6109,7 @@
         <w:drawing>
           <wp:inline xmlns:a="http://schemas.openxmlformats.org/drawingml/2006/main" xmlns:pic="http://schemas.openxmlformats.org/drawingml/2006/picture">
             <wp:extent cx="2468880" cy="2468880"/>
-            <wp:docPr id="10" name="Picture 10"/>
+            <wp:docPr id="20" name="Picture 20"/>
             <wp:cNvGraphicFramePr>
               <a:graphicFrameLocks noChangeAspect="1"/>
             </wp:cNvGraphicFramePr>
@@ -3768,7 +6121,7 @@
                     <pic:cNvPicPr/>
                   </pic:nvPicPr>
                   <pic:blipFill>
-                    <a:blip r:embed="rId19"/>
+                    <a:blip r:embed="rId29"/>
                     <a:stretch>
                       <a:fillRect/>
                     </a:stretch>
@@ -3812,7 +6165,7 @@
         <w:drawing>
           <wp:inline xmlns:a="http://schemas.openxmlformats.org/drawingml/2006/main" xmlns:pic="http://schemas.openxmlformats.org/drawingml/2006/picture">
             <wp:extent cx="2468880" cy="2468880"/>
-            <wp:docPr id="11" name="Picture 11"/>
+            <wp:docPr id="21" name="Picture 21"/>
             <wp:cNvGraphicFramePr>
               <a:graphicFrameLocks noChangeAspect="1"/>
             </wp:cNvGraphicFramePr>
@@ -3824,7 +6177,7 @@
                     <pic:cNvPicPr/>
                   </pic:nvPicPr>
                   <pic:blipFill>
-                    <a:blip r:embed="rId20"/>
+                    <a:blip r:embed="rId30"/>
                     <a:stretch>
                       <a:fillRect/>
                     </a:stretch>

</xml_diff>